<commit_message>
Paper: captions below figures (Fig. N:), full-width readable diagrams and charts; deck: detailed landscape architecture
Co-Authored-By: Claude Opus 5.5 <noreply@anthropic.com>
</commit_message>
<xml_diff>
--- a/reports/paper/InsightDesk_paper.docx
+++ b/reports/paper/InsightDesk_paper.docx
@@ -1418,13 +1418,13 @@
     </w:p>
     <w:p>
       <w:pPr>
-        <w:spacing w:after="160" w:before="0"/>
+        <w:spacing w:after="40" w:before="120"/>
         <w:jc w:val="center"/>
       </w:pPr>
       <w:r>
         <w:drawing>
           <wp:inline xmlns:a="http://schemas.openxmlformats.org/drawingml/2006/main" xmlns:pic="http://schemas.openxmlformats.org/drawingml/2006/picture">
-            <wp:extent cx="4572000" cy="6708321"/>
+            <wp:extent cx="5486400" cy="7731579"/>
             <wp:docPr id="1" name="Picture 1"/>
             <wp:cNvGraphicFramePr>
               <a:graphicFrameLocks noChangeAspect="1"/>
@@ -1445,7 +1445,7 @@
                   <pic:spPr>
                     <a:xfrm>
                       <a:off x="0" y="0"/>
-                      <a:ext cx="4572000" cy="6708321"/>
+                      <a:ext cx="5486400" cy="7731579"/>
                     </a:xfrm>
                     <a:prstGeom prst="rect"/>
                   </pic:spPr>
@@ -1458,6 +1458,19 @@
     </w:p>
     <w:p>
       <w:pPr>
+        <w:spacing w:after="160" w:before="0"/>
+        <w:jc w:val="center"/>
+      </w:pPr>
+      <w:r>
+        <w:rPr>
+          <w:i/>
+          <w:sz w:val="22"/>
+        </w:rPr>
+        <w:t>Fig. 1: Flowchart of the InsightDesk pipeline (t_low = 0.40 for app reviews and chat, 0.26 for tickets and bug reports)</w:t>
+      </w:r>
+    </w:p>
+    <w:p>
+      <w:pPr>
         <w:sectPr>
           <w:type w:val="continuous"/>
           <w:pgSz w:w="12240" w:h="15840"/>
@@ -1480,13 +1493,13 @@
     </w:p>
     <w:p>
       <w:pPr>
-        <w:spacing w:after="160" w:before="0"/>
+        <w:spacing w:after="40" w:before="120"/>
         <w:jc w:val="center"/>
       </w:pPr>
       <w:r>
         <w:drawing>
           <wp:inline xmlns:a="http://schemas.openxmlformats.org/drawingml/2006/main" xmlns:pic="http://schemas.openxmlformats.org/drawingml/2006/picture">
-            <wp:extent cx="6035040" cy="6807381"/>
+            <wp:extent cx="6400800" cy="2600325"/>
             <wp:docPr id="2" name="Picture 2"/>
             <wp:cNvGraphicFramePr>
               <a:graphicFrameLocks noChangeAspect="1"/>
@@ -1507,7 +1520,7 @@
                   <pic:spPr>
                     <a:xfrm>
                       <a:off x="0" y="0"/>
-                      <a:ext cx="6035040" cy="6807381"/>
+                      <a:ext cx="6400800" cy="2600325"/>
                     </a:xfrm>
                     <a:prstGeom prst="rect"/>
                   </pic:spPr>
@@ -1516,6 +1529,19 @@
             </a:graphic>
           </wp:inline>
         </w:drawing>
+      </w:r>
+    </w:p>
+    <w:p>
+      <w:pPr>
+        <w:spacing w:after="160" w:before="0"/>
+        <w:jc w:val="center"/>
+      </w:pPr>
+      <w:r>
+        <w:rPr>
+          <w:i/>
+          <w:sz w:val="22"/>
+        </w:rPr>
+        <w:t>Fig. 2: System architecture: nine phases over two stores</w:t>
       </w:r>
     </w:p>
     <w:p>
@@ -4098,13 +4124,24 @@
     </w:p>
     <w:p>
       <w:pPr>
-        <w:spacing w:after="160" w:before="0"/>
+        <w:sectPr>
+          <w:type w:val="continuous"/>
+          <w:pgSz w:w="12240" w:h="15840"/>
+          <w:pgMar w:top="1080" w:right="1008" w:bottom="1440" w:left="1008" w:header="720" w:footer="720" w:gutter="0"/>
+          <w:cols w:space="360" w:num="2"/>
+          <w:docGrid w:linePitch="360"/>
+        </w:sectPr>
+      </w:pPr>
+    </w:p>
+    <w:p>
+      <w:pPr>
+        <w:spacing w:after="40" w:before="120"/>
         <w:jc w:val="center"/>
       </w:pPr>
       <w:r>
         <w:drawing>
           <wp:inline xmlns:a="http://schemas.openxmlformats.org/drawingml/2006/main" xmlns:pic="http://schemas.openxmlformats.org/drawingml/2006/picture">
-            <wp:extent cx="3154680" cy="1896564"/>
+            <wp:extent cx="5486400" cy="2890157"/>
             <wp:docPr id="14" name="Picture 14"/>
             <wp:cNvGraphicFramePr>
               <a:graphicFrameLocks noChangeAspect="1"/>
@@ -4113,7 +4150,7 @@
               <a:graphicData uri="http://schemas.openxmlformats.org/drawingml/2006/picture">
                 <pic:pic>
                   <pic:nvPicPr>
-                    <pic:cNvPr id="0" name="fig3.png"/>
+                    <pic:cNvPr id="0" name="fig3c.png"/>
                     <pic:cNvPicPr/>
                   </pic:nvPicPr>
                   <pic:blipFill>
@@ -4125,7 +4162,7 @@
                   <pic:spPr>
                     <a:xfrm>
                       <a:off x="0" y="0"/>
-                      <a:ext cx="3154680" cy="1896564"/>
+                      <a:ext cx="5486400" cy="2890157"/>
                     </a:xfrm>
                     <a:prstGeom prst="rect"/>
                   </pic:spPr>
@@ -4142,9 +4179,44 @@
         <w:jc w:val="center"/>
       </w:pPr>
       <w:r>
+        <w:rPr>
+          <w:i/>
+          <w:sz w:val="22"/>
+        </w:rPr>
+        <w:t>Fig. 3: Pairwise F1 against published methods on identical data (Play Store held-out halves; Firefox sample 3)</w:t>
+      </w:r>
+    </w:p>
+    <w:p>
+      <w:pPr>
+        <w:sectPr>
+          <w:type w:val="continuous"/>
+          <w:pgSz w:w="12240" w:h="15840"/>
+          <w:pgMar w:top="1080" w:right="1008" w:bottom="1440" w:left="1008" w:header="720" w:footer="720" w:gutter="0"/>
+          <w:cols w:space="360" w:num="1"/>
+          <w:docGrid w:linePitch="360"/>
+        </w:sectPr>
+      </w:pPr>
+    </w:p>
+    <w:p>
+      <w:pPr>
+        <w:sectPr>
+          <w:type w:val="continuous"/>
+          <w:pgSz w:w="12240" w:h="15840"/>
+          <w:pgMar w:top="1080" w:right="1008" w:bottom="1440" w:left="1008" w:header="720" w:footer="720" w:gutter="0"/>
+          <w:cols w:space="360" w:num="2"/>
+          <w:docGrid w:linePitch="360"/>
+        </w:sectPr>
+      </w:pPr>
+    </w:p>
+    <w:p>
+      <w:pPr>
+        <w:spacing w:after="40" w:before="120"/>
+        <w:jc w:val="center"/>
+      </w:pPr>
+      <w:r>
         <w:drawing>
           <wp:inline xmlns:a="http://schemas.openxmlformats.org/drawingml/2006/main" xmlns:pic="http://schemas.openxmlformats.org/drawingml/2006/picture">
-            <wp:extent cx="3154680" cy="1859008"/>
+            <wp:extent cx="5486400" cy="2824843"/>
             <wp:docPr id="15" name="Picture 15"/>
             <wp:cNvGraphicFramePr>
               <a:graphicFrameLocks noChangeAspect="1"/>
@@ -4153,7 +4225,7 @@
               <a:graphicData uri="http://schemas.openxmlformats.org/drawingml/2006/picture">
                 <pic:pic>
                   <pic:nvPicPr>
-                    <pic:cNvPr id="0" name="fig4.png"/>
+                    <pic:cNvPr id="0" name="fig4c.png"/>
                     <pic:cNvPicPr/>
                   </pic:nvPicPr>
                   <pic:blipFill>
@@ -4165,7 +4237,7 @@
                   <pic:spPr>
                     <a:xfrm>
                       <a:off x="0" y="0"/>
-                      <a:ext cx="3154680" cy="1859008"/>
+                      <a:ext cx="5486400" cy="2824843"/>
                     </a:xfrm>
                     <a:prstGeom prst="rect"/>
                   </pic:spPr>
@@ -4178,6 +4250,30 @@
     </w:p>
     <w:p>
       <w:pPr>
+        <w:spacing w:after="160" w:before="0"/>
+        <w:jc w:val="center"/>
+      </w:pPr>
+      <w:r>
+        <w:rPr>
+          <w:i/>
+          <w:sz w:val="22"/>
+        </w:rPr>
+        <w:t>Fig. 4: Pairwise precision and recall of every method, Play Store held-out halves</w:t>
+      </w:r>
+    </w:p>
+    <w:p>
+      <w:pPr>
+        <w:sectPr>
+          <w:type w:val="continuous"/>
+          <w:pgSz w:w="12240" w:h="15840"/>
+          <w:pgMar w:top="1080" w:right="1008" w:bottom="1440" w:left="1008" w:header="720" w:footer="720" w:gutter="0"/>
+          <w:cols w:space="360" w:num="1"/>
+          <w:docGrid w:linePitch="360"/>
+        </w:sectPr>
+      </w:pPr>
+    </w:p>
+    <w:p>
+      <w:pPr>
         <w:spacing w:after="80" w:before="0"/>
         <w:ind w:firstLine="288"/>
         <w:jc w:val="both"/>
@@ -4194,13 +4290,24 @@
     </w:p>
     <w:p>
       <w:pPr>
-        <w:spacing w:after="160" w:before="0"/>
+        <w:sectPr>
+          <w:type w:val="continuous"/>
+          <w:pgSz w:w="12240" w:h="15840"/>
+          <w:pgMar w:top="1080" w:right="1008" w:bottom="1440" w:left="1008" w:header="720" w:footer="720" w:gutter="0"/>
+          <w:cols w:space="360" w:num="2"/>
+          <w:docGrid w:linePitch="360"/>
+        </w:sectPr>
+      </w:pPr>
+    </w:p>
+    <w:p>
+      <w:pPr>
+        <w:spacing w:after="40" w:before="120"/>
         <w:jc w:val="center"/>
       </w:pPr>
       <w:r>
         <w:drawing>
           <wp:inline xmlns:a="http://schemas.openxmlformats.org/drawingml/2006/main" xmlns:pic="http://schemas.openxmlformats.org/drawingml/2006/picture">
-            <wp:extent cx="3154680" cy="1525701"/>
+            <wp:extent cx="5486400" cy="2367643"/>
             <wp:docPr id="16" name="Picture 16"/>
             <wp:cNvGraphicFramePr>
               <a:graphicFrameLocks noChangeAspect="1"/>
@@ -4209,7 +4316,7 @@
               <a:graphicData uri="http://schemas.openxmlformats.org/drawingml/2006/picture">
                 <pic:pic>
                   <pic:nvPicPr>
-                    <pic:cNvPr id="0" name="fig5.png"/>
+                    <pic:cNvPr id="0" name="fig5c.png"/>
                     <pic:cNvPicPr/>
                   </pic:nvPicPr>
                   <pic:blipFill>
@@ -4221,7 +4328,7 @@
                   <pic:spPr>
                     <a:xfrm>
                       <a:off x="0" y="0"/>
-                      <a:ext cx="3154680" cy="1525701"/>
+                      <a:ext cx="5486400" cy="2367643"/>
                     </a:xfrm>
                     <a:prstGeom prst="rect"/>
                   </pic:spPr>
@@ -4231,6 +4338,30 @@
           </wp:inline>
         </w:drawing>
       </w:r>
+    </w:p>
+    <w:p>
+      <w:pPr>
+        <w:spacing w:after="160" w:before="0"/>
+        <w:jc w:val="center"/>
+      </w:pPr>
+      <w:r>
+        <w:rPr>
+          <w:i/>
+          <w:sz w:val="22"/>
+        </w:rPr>
+        <w:t>Fig. 5: Recall with and without one re-joining pass; precision shown below each pair</w:t>
+      </w:r>
+    </w:p>
+    <w:p>
+      <w:pPr>
+        <w:sectPr>
+          <w:type w:val="continuous"/>
+          <w:pgSz w:w="12240" w:h="15840"/>
+          <w:pgMar w:top="1080" w:right="1008" w:bottom="1440" w:left="1008" w:header="720" w:footer="720" w:gutter="0"/>
+          <w:cols w:space="360" w:num="1"/>
+          <w:docGrid w:linePitch="360"/>
+        </w:sectPr>
+      </w:pPr>
     </w:p>
     <w:p>
       <w:pPr>
@@ -4866,13 +4997,24 @@
     </w:p>
     <w:p>
       <w:pPr>
-        <w:spacing w:after="160" w:before="0"/>
+        <w:sectPr>
+          <w:type w:val="continuous"/>
+          <w:pgSz w:w="12240" w:h="15840"/>
+          <w:pgMar w:top="1080" w:right="1008" w:bottom="1440" w:left="1008" w:header="720" w:footer="720" w:gutter="0"/>
+          <w:cols w:space="360" w:num="2"/>
+          <w:docGrid w:linePitch="360"/>
+        </w:sectPr>
+      </w:pPr>
+    </w:p>
+    <w:p>
+      <w:pPr>
+        <w:spacing w:after="40" w:before="120"/>
         <w:jc w:val="center"/>
       </w:pPr>
       <w:r>
         <w:drawing>
           <wp:inline xmlns:a="http://schemas.openxmlformats.org/drawingml/2006/main" xmlns:pic="http://schemas.openxmlformats.org/drawingml/2006/picture">
-            <wp:extent cx="3154680" cy="1398950"/>
+            <wp:extent cx="5486400" cy="2024743"/>
             <wp:docPr id="17" name="Picture 17"/>
             <wp:cNvGraphicFramePr>
               <a:graphicFrameLocks noChangeAspect="1"/>
@@ -4881,7 +5023,7 @@
               <a:graphicData uri="http://schemas.openxmlformats.org/drawingml/2006/picture">
                 <pic:pic>
                   <pic:nvPicPr>
-                    <pic:cNvPr id="0" name="fig6.png"/>
+                    <pic:cNvPr id="0" name="fig6c.png"/>
                     <pic:cNvPicPr/>
                   </pic:nvPicPr>
                   <pic:blipFill>
@@ -4893,7 +5035,7 @@
                   <pic:spPr>
                     <a:xfrm>
                       <a:off x="0" y="0"/>
-                      <a:ext cx="3154680" cy="1398950"/>
+                      <a:ext cx="5486400" cy="2024743"/>
                     </a:xfrm>
                     <a:prstGeom prst="rect"/>
                   </pic:spPr>
@@ -4903,6 +5045,30 @@
           </wp:inline>
         </w:drawing>
       </w:r>
+    </w:p>
+    <w:p>
+      <w:pPr>
+        <w:spacing w:after="160" w:before="0"/>
+        <w:jc w:val="center"/>
+      </w:pPr>
+      <w:r>
+        <w:rPr>
+          <w:i/>
+          <w:sz w:val="22"/>
+        </w:rPr>
+        <w:t>Fig. 6: Share of simulated incidents detected in 6-hour windows; InsightDesk under one false alarm per 100 windows</w:t>
+      </w:r>
+    </w:p>
+    <w:p>
+      <w:pPr>
+        <w:sectPr>
+          <w:type w:val="continuous"/>
+          <w:pgSz w:w="12240" w:h="15840"/>
+          <w:pgMar w:top="1080" w:right="1008" w:bottom="1440" w:left="1008" w:header="720" w:footer="720" w:gutter="0"/>
+          <w:cols w:space="360" w:num="1"/>
+          <w:docGrid w:linePitch="360"/>
+        </w:sectPr>
+      </w:pPr>
     </w:p>
     <w:p>
       <w:pPr>

</xml_diff>

<commit_message>
Paper: department rule, case sentiment source, re-cluster triggers, topic coherence (c_v 0.49 vs 0.38 random), vague-alarm threshold calibration
</commit_message>
<xml_diff>
--- a/reports/paper/InsightDesk_paper.docx
+++ b/reports/paper/InsightDesk_paper.docx
@@ -2411,7 +2411,43 @@
           <w:i w:val="0"/>
           <w:sz w:val="24"/>
         </w:rPr>
-        <w:t>Each case receives a sentiment label from RoBERTa [17] (cardiffnlp twitter-roberta-base-sentiment-latest) with three classes (negative, neutral, positive) and its confidence. Evaluated on real Play Store reviews against star ratings (1–2 negative, 3 neutral, 4–5 positive), it reaches accuracy 0.707, with precision 0.81 and recall 0.85 on negative complaints; DistilBERT reached accuracy 0.713 but is binary, cannot say neutral, and is less precise on negatives (0.77). Topics come from BERTopic [16] over case texts: UMAP [27] with 12 neighbours, 5 components and cosine distance, then HDBSCAN [28] with minimum cluster size 3 and minimum samples 1, and keywords from a 1–2-gram c-TF-IDF (minimum document frequency 2). Topics are recomputed on the first run, when the number of cases has grown by 20%, when outliers exceed 15%, or at a scheduled refresh. Each topic’s keywords map to a department (for example Authentication, Engineering or Customer Success), which is the address an escalation goes to. On 319 staging cases this produced 49 topics with 11.9% outliers. In the running example the case is labelled negative and placed under an Authentication topic.</w:t>
+        <w:t>Each case receives a sentiment label from RoBERTa [17] (cardiffnlp twitter-roberta-base-sentiment-latest) with three classes (negative, neutral, positive) and its confidence</w:t>
+      </w:r>
+      <w:r>
+        <w:rPr>
+          <w:rFonts w:ascii="Times New Roman" w:hAnsi="Times New Roman"/>
+          <w:b w:val="0"/>
+          <w:i w:val="0"/>
+          <w:sz w:val="24"/>
+        </w:rPr>
+        <w:t>, computed once from the case’s founding complaint (its representative text), so later reports do not change it</w:t>
+      </w:r>
+      <w:r>
+        <w:rPr>
+          <w:rFonts w:ascii="Times New Roman" w:hAnsi="Times New Roman"/>
+          <w:b w:val="0"/>
+          <w:i w:val="0"/>
+          <w:sz w:val="24"/>
+        </w:rPr>
+        <w:t>. Evaluated on real Play Store reviews against star ratings (1–2 negative, 3 neutral, 4–5 positive), it reaches accuracy 0.707, with precision 0.81 and recall 0.85 on negative complaints; DistilBERT reached accuracy 0.713 but is binary, cannot say neutral, and is less precise on negatives (0.77). Topics come from BERTopic [16] over case texts: UMAP [27] with 12 neighbours, 5 components and cosine distance, then HDBSCAN [28] with minimum cluster size 3 and minimum samples 1, and keywords from a 1–2-gram c-TF-IDF (minimum document frequency 2). Topics are recomputed on the first run, when the number of cases has grown by 20%, when outliers exceed 15%, or at a scheduled refresh</w:t>
+      </w:r>
+      <w:r>
+        <w:rPr>
+          <w:rFonts w:ascii="Times New Roman" w:hAnsi="Times New Roman"/>
+          <w:b w:val="0"/>
+          <w:i w:val="0"/>
+          <w:sz w:val="24"/>
+        </w:rPr>
+        <w:t>; the 20% and 15% triggers are operating defaults chosen empirically, not tuned. Departments come from a fixed rule table, not an LLM: five departments (Engineering, Authentication, Payments, Customer Success, Platform) each have a list of trigger words (for Authentication: login, password, otp, signin, verification, token), a topic goes to the department whose list matches most of its five top keywords, a topic with no match goes to General Support, and an operator can override the department in the dashboard. On the 306 cases of the test deployment BERTopic found 44 topics and left 41 cases (13%) as outliers. Their c_v coherence is 0.49, against 0.38 for random five-word sets from the same texts, so the topics are moderately coherent; the largest are login and sign-in (19 cases), notifications (18), reinstalling or the app not working (16), support plans (15) and crashes after a new version (10). The rule table routed only 19 of the 44 topics to a named department and sent 25 to General Support, so routing is the weakest step; a learned or LLM-based mapping is left to future work</w:t>
+      </w:r>
+      <w:r>
+        <w:rPr>
+          <w:rFonts w:ascii="Times New Roman" w:hAnsi="Times New Roman"/>
+          <w:b w:val="0"/>
+          <w:i w:val="0"/>
+          <w:sz w:val="24"/>
+        </w:rPr>
+        <w:t>. In the running example the case is labelled negative and placed under an Authentication topic.</w:t>
       </w:r>
     </w:p>
     <w:p>
@@ -2737,6 +2773,15 @@
           <w:sz w:val="24"/>
         </w:rPr>
         <w:t>An alarm reports when the surge started and which cases were active in the same windows, so an outage reported only as “the app is not working” still reaches an operator.</w:t>
+      </w:r>
+      <w:r>
+        <w:rPr>
+          <w:rFonts w:ascii="Times New Roman" w:hAnsi="Times New Roman"/>
+          <w:b w:val="0"/>
+          <w:i w:val="0"/>
+          <w:sz w:val="24"/>
+        </w:rPr>
+        <w:t xml:space="preserve"> The threshold was fixed before testing: among p ∈ {0.01, 0.001} and a minimum count m ∈ {2, 3, 4}, p &lt; 0.001 with m = 2 was the loosest setting that kept false alerts at or below 2 per 100 windows on both tuning sets (p = 0.01 gave 3.35 on bug reports). Confirmed unchanged on 588 reviews of unseen apps, the alarm detected every 10-complaint vague outage at a cost of 0.19 extra false alerts per 100 windows.</w:t>
       </w:r>
     </w:p>
     <w:p>

</xml_diff>

<commit_message>
Paper: figures float to page tops with captions (no blank space), Fig. 2 anchored later
</commit_message>
<xml_diff>
--- a/reports/paper/InsightDesk_paper.docx
+++ b/reports/paper/InsightDesk_paper.docx
@@ -1407,33 +1407,29 @@
     </w:p>
     <w:p>
       <w:pPr>
-        <w:sectPr>
-          <w:type w:val="continuous"/>
-          <w:pgSz w:w="12240" w:h="15840"/>
-          <w:pgMar w:top="1080" w:right="1008" w:bottom="1440" w:left="1008" w:header="720" w:footer="720" w:gutter="0"/>
-          <w:cols w:space="360" w:num="2"/>
-          <w:docGrid w:linePitch="360"/>
-        </w:sectPr>
-      </w:pPr>
-    </w:p>
-    <w:p>
-      <w:pPr>
-        <w:spacing w:after="40" w:before="120"/>
+        <w:spacing w:after="0" w:before="0"/>
         <w:jc w:val="center"/>
       </w:pPr>
       <w:r>
         <w:drawing>
-          <wp:inline xmlns:a="http://schemas.openxmlformats.org/drawingml/2006/main" xmlns:pic="http://schemas.openxmlformats.org/drawingml/2006/picture">
-            <wp:extent cx="5486400" cy="7731579"/>
+          <wp:anchor distT="0" distB="114300" distL="0" distR="0" simplePos="0" relativeHeight="251659264" behindDoc="0" locked="0" layoutInCell="1" allowOverlap="0">
+            <wp:simplePos x="0" y="0"/>
+            <wp:positionH relativeFrom="margin">
+              <wp:align>center</wp:align>
+            </wp:positionH>
+            <wp:positionV relativeFrom="margin">
+              <wp:align>top</wp:align>
+            </wp:positionV>
+            <wp:extent cx="4754880" cy="7146471"/>
+            <wp:effectExtent l="0" t="0" r="0" b="0"/>
+            <wp:wrapTopAndBottom/>
             <wp:docPr id="1" name="Picture 1"/>
-            <wp:cNvGraphicFramePr>
-              <a:graphicFrameLocks noChangeAspect="1"/>
-            </wp:cNvGraphicFramePr>
-            <a:graphic>
+            <wp:cNvGraphicFramePr/>
+            <a:graphic xmlns:a="http://schemas.openxmlformats.org/drawingml/2006/main" xmlns:pic="http://schemas.openxmlformats.org/drawingml/2006/picture">
               <a:graphicData uri="http://schemas.openxmlformats.org/drawingml/2006/picture">
                 <pic:pic>
                   <pic:nvPicPr>
-                    <pic:cNvPr id="0" name="fig1.png"/>
+                    <pic:cNvPr id="0" name="fig1_cap.png"/>
                     <pic:cNvPicPr/>
                   </pic:nvPicPr>
                   <pic:blipFill>
@@ -1445,115 +1441,16 @@
                   <pic:spPr>
                     <a:xfrm>
                       <a:off x="0" y="0"/>
-                      <a:ext cx="5486400" cy="7731579"/>
+                      <a:ext cx="4754880" cy="7146471"/>
                     </a:xfrm>
                     <a:prstGeom prst="rect"/>
                   </pic:spPr>
                 </pic:pic>
               </a:graphicData>
             </a:graphic>
-          </wp:inline>
+          </wp:anchor>
         </w:drawing>
       </w:r>
-    </w:p>
-    <w:p>
-      <w:pPr>
-        <w:spacing w:after="160" w:before="0"/>
-        <w:jc w:val="center"/>
-      </w:pPr>
-      <w:r>
-        <w:rPr>
-          <w:i/>
-          <w:sz w:val="22"/>
-        </w:rPr>
-        <w:t>Fig. 1: Flowchart of the InsightDesk pipeline (t_low = 0.40 for app reviews and chat, 0.26 for tickets and bug reports)</w:t>
-      </w:r>
-    </w:p>
-    <w:p>
-      <w:pPr>
-        <w:sectPr>
-          <w:type w:val="continuous"/>
-          <w:pgSz w:w="12240" w:h="15840"/>
-          <w:pgMar w:top="1080" w:right="1008" w:bottom="1440" w:left="1008" w:header="720" w:footer="720" w:gutter="0"/>
-          <w:cols w:space="360" w:num="1"/>
-          <w:docGrid w:linePitch="360"/>
-        </w:sectPr>
-      </w:pPr>
-    </w:p>
-    <w:p>
-      <w:pPr>
-        <w:sectPr>
-          <w:type w:val="continuous"/>
-          <w:pgSz w:w="12240" w:h="15840"/>
-          <w:pgMar w:top="1080" w:right="1008" w:bottom="1440" w:left="1008" w:header="720" w:footer="720" w:gutter="0"/>
-          <w:cols w:space="360" w:num="2"/>
-          <w:docGrid w:linePitch="360"/>
-        </w:sectPr>
-      </w:pPr>
-    </w:p>
-    <w:p>
-      <w:pPr>
-        <w:spacing w:after="40" w:before="120"/>
-        <w:jc w:val="center"/>
-      </w:pPr>
-      <w:r>
-        <w:drawing>
-          <wp:inline xmlns:a="http://schemas.openxmlformats.org/drawingml/2006/main" xmlns:pic="http://schemas.openxmlformats.org/drawingml/2006/picture">
-            <wp:extent cx="6400800" cy="2600325"/>
-            <wp:docPr id="2" name="Picture 2"/>
-            <wp:cNvGraphicFramePr>
-              <a:graphicFrameLocks noChangeAspect="1"/>
-            </wp:cNvGraphicFramePr>
-            <a:graphic>
-              <a:graphicData uri="http://schemas.openxmlformats.org/drawingml/2006/picture">
-                <pic:pic>
-                  <pic:nvPicPr>
-                    <pic:cNvPr id="0" name="fig2.png"/>
-                    <pic:cNvPicPr/>
-                  </pic:nvPicPr>
-                  <pic:blipFill>
-                    <a:blip r:embed="rId10"/>
-                    <a:stretch>
-                      <a:fillRect/>
-                    </a:stretch>
-                  </pic:blipFill>
-                  <pic:spPr>
-                    <a:xfrm>
-                      <a:off x="0" y="0"/>
-                      <a:ext cx="6400800" cy="2600325"/>
-                    </a:xfrm>
-                    <a:prstGeom prst="rect"/>
-                  </pic:spPr>
-                </pic:pic>
-              </a:graphicData>
-            </a:graphic>
-          </wp:inline>
-        </w:drawing>
-      </w:r>
-    </w:p>
-    <w:p>
-      <w:pPr>
-        <w:spacing w:after="160" w:before="0"/>
-        <w:jc w:val="center"/>
-      </w:pPr>
-      <w:r>
-        <w:rPr>
-          <w:i/>
-          <w:sz w:val="22"/>
-        </w:rPr>
-        <w:t>Fig. 2: System architecture: nine phases over two stores</w:t>
-      </w:r>
-    </w:p>
-    <w:p>
-      <w:pPr>
-        <w:sectPr>
-          <w:type w:val="continuous"/>
-          <w:pgSz w:w="12240" w:h="15840"/>
-          <w:pgMar w:top="1080" w:right="1008" w:bottom="1440" w:left="1008" w:header="720" w:footer="720" w:gutter="0"/>
-          <w:cols w:space="360" w:num="1"/>
-          <w:docGrid w:linePitch="360"/>
-        </w:sectPr>
-      </w:pPr>
     </w:p>
     <w:p>
       <w:pPr>
@@ -1628,6 +1525,53 @@
           <w:sz w:val="24"/>
         </w:rPr>
         <w:t>A signed-in customer submits a complaint through the React dashboard or an API client; the FastAPI service stores it with its product, user and source channel (for example web form, app review or chat). Text beyond 5,000 characters is truncated. Cleaning uses label-free boilerplate suppression. The text is split into segments (sentences, clauses and a lead-in phrase). A segment is a boilerplate candidate when it recurs in at least 8 complaints with segment cosine similarity of at least 0.90, and it is confirmed as boilerplate when the remaining text of those complaints is unrelated (mean cosine below 0.30), as with greetings such as “Hi team, please help”. Boilerplate is dropped while at least one segment is always kept; the text is lower-cased and stripped of punctuation and stop words. Negations (not, never, can’t) are kept, because “works” and “doesn’t work” must not look alike. The original text is kept for display and for the LLM judge. For the running example, only the complaint itself remains.</w:t>
+      </w:r>
+    </w:p>
+    <w:p>
+      <w:pPr>
+        <w:spacing w:after="0" w:before="0"/>
+        <w:jc w:val="center"/>
+      </w:pPr>
+      <w:r>
+        <w:drawing>
+          <wp:anchor distT="0" distB="114300" distL="0" distR="0" simplePos="0" relativeHeight="251659264" behindDoc="0" locked="0" layoutInCell="1" allowOverlap="0">
+            <wp:simplePos x="0" y="0"/>
+            <wp:positionH relativeFrom="margin">
+              <wp:align>center</wp:align>
+            </wp:positionH>
+            <wp:positionV relativeFrom="margin">
+              <wp:align>top</wp:align>
+            </wp:positionV>
+            <wp:extent cx="6400800" cy="2871788"/>
+            <wp:effectExtent l="0" t="0" r="0" b="0"/>
+            <wp:wrapTopAndBottom/>
+            <wp:docPr id="2" name="Picture 2"/>
+            <wp:cNvGraphicFramePr/>
+            <a:graphic xmlns:a="http://schemas.openxmlformats.org/drawingml/2006/main" xmlns:pic="http://schemas.openxmlformats.org/drawingml/2006/picture">
+              <a:graphicData uri="http://schemas.openxmlformats.org/drawingml/2006/picture">
+                <pic:pic>
+                  <pic:nvPicPr>
+                    <pic:cNvPr id="0" name="fig2_cap.png"/>
+                    <pic:cNvPicPr/>
+                  </pic:nvPicPr>
+                  <pic:blipFill>
+                    <a:blip r:embed="rId10"/>
+                    <a:stretch>
+                      <a:fillRect/>
+                    </a:stretch>
+                  </pic:blipFill>
+                  <pic:spPr>
+                    <a:xfrm>
+                      <a:off x="0" y="0"/>
+                      <a:ext cx="6400800" cy="2871788"/>
+                    </a:xfrm>
+                    <a:prstGeom prst="rect"/>
+                  </pic:spPr>
+                </pic:pic>
+              </a:graphicData>
+            </a:graphic>
+          </wp:anchor>
+        </w:drawing>
       </w:r>
     </w:p>
     <w:p>
@@ -4169,33 +4113,29 @@
     </w:p>
     <w:p>
       <w:pPr>
-        <w:sectPr>
-          <w:type w:val="continuous"/>
-          <w:pgSz w:w="12240" w:h="15840"/>
-          <w:pgMar w:top="1080" w:right="1008" w:bottom="1440" w:left="1008" w:header="720" w:footer="720" w:gutter="0"/>
-          <w:cols w:space="360" w:num="2"/>
-          <w:docGrid w:linePitch="360"/>
-        </w:sectPr>
-      </w:pPr>
-    </w:p>
-    <w:p>
-      <w:pPr>
-        <w:spacing w:after="40" w:before="120"/>
+        <w:spacing w:after="0" w:before="0"/>
         <w:jc w:val="center"/>
       </w:pPr>
       <w:r>
         <w:drawing>
-          <wp:inline xmlns:a="http://schemas.openxmlformats.org/drawingml/2006/main" xmlns:pic="http://schemas.openxmlformats.org/drawingml/2006/picture">
-            <wp:extent cx="5486400" cy="2890157"/>
+          <wp:anchor distT="0" distB="114300" distL="0" distR="0" simplePos="0" relativeHeight="251659264" behindDoc="0" locked="0" layoutInCell="1" allowOverlap="0">
+            <wp:simplePos x="0" y="0"/>
+            <wp:positionH relativeFrom="margin">
+              <wp:align>center</wp:align>
+            </wp:positionH>
+            <wp:positionV relativeFrom="margin">
+              <wp:align>top</wp:align>
+            </wp:positionV>
+            <wp:extent cx="5486400" cy="3331029"/>
+            <wp:effectExtent l="0" t="0" r="0" b="0"/>
+            <wp:wrapTopAndBottom/>
             <wp:docPr id="14" name="Picture 14"/>
-            <wp:cNvGraphicFramePr>
-              <a:graphicFrameLocks noChangeAspect="1"/>
-            </wp:cNvGraphicFramePr>
-            <a:graphic>
+            <wp:cNvGraphicFramePr/>
+            <a:graphic xmlns:a="http://schemas.openxmlformats.org/drawingml/2006/main" xmlns:pic="http://schemas.openxmlformats.org/drawingml/2006/picture">
               <a:graphicData uri="http://schemas.openxmlformats.org/drawingml/2006/picture">
                 <pic:pic>
                   <pic:nvPicPr>
-                    <pic:cNvPr id="0" name="fig3c.png"/>
+                    <pic:cNvPr id="0" name="fig3_cap.png"/>
                     <pic:cNvPicPr/>
                   </pic:nvPicPr>
                   <pic:blipFill>
@@ -4207,70 +4147,42 @@
                   <pic:spPr>
                     <a:xfrm>
                       <a:off x="0" y="0"/>
-                      <a:ext cx="5486400" cy="2890157"/>
+                      <a:ext cx="5486400" cy="3331029"/>
                     </a:xfrm>
                     <a:prstGeom prst="rect"/>
                   </pic:spPr>
                 </pic:pic>
               </a:graphicData>
             </a:graphic>
-          </wp:inline>
+          </wp:anchor>
         </w:drawing>
       </w:r>
     </w:p>
     <w:p>
       <w:pPr>
-        <w:spacing w:after="160" w:before="0"/>
-        <w:jc w:val="center"/>
-      </w:pPr>
-      <w:r>
-        <w:rPr>
-          <w:i/>
-          <w:sz w:val="22"/>
-        </w:rPr>
-        <w:t>Fig. 3: Pairwise F1 against published methods on identical data (Play Store held-out halves; Firefox sample 3)</w:t>
-      </w:r>
-    </w:p>
-    <w:p>
-      <w:pPr>
-        <w:sectPr>
-          <w:type w:val="continuous"/>
-          <w:pgSz w:w="12240" w:h="15840"/>
-          <w:pgMar w:top="1080" w:right="1008" w:bottom="1440" w:left="1008" w:header="720" w:footer="720" w:gutter="0"/>
-          <w:cols w:space="360" w:num="1"/>
-          <w:docGrid w:linePitch="360"/>
-        </w:sectPr>
-      </w:pPr>
-    </w:p>
-    <w:p>
-      <w:pPr>
-        <w:sectPr>
-          <w:type w:val="continuous"/>
-          <w:pgSz w:w="12240" w:h="15840"/>
-          <w:pgMar w:top="1080" w:right="1008" w:bottom="1440" w:left="1008" w:header="720" w:footer="720" w:gutter="0"/>
-          <w:cols w:space="360" w:num="2"/>
-          <w:docGrid w:linePitch="360"/>
-        </w:sectPr>
-      </w:pPr>
-    </w:p>
-    <w:p>
-      <w:pPr>
-        <w:spacing w:after="40" w:before="120"/>
+        <w:spacing w:after="0" w:before="0"/>
         <w:jc w:val="center"/>
       </w:pPr>
       <w:r>
         <w:drawing>
-          <wp:inline xmlns:a="http://schemas.openxmlformats.org/drawingml/2006/main" xmlns:pic="http://schemas.openxmlformats.org/drawingml/2006/picture">
-            <wp:extent cx="5486400" cy="2824843"/>
+          <wp:anchor distT="0" distB="114300" distL="0" distR="0" simplePos="0" relativeHeight="251659264" behindDoc="0" locked="0" layoutInCell="1" allowOverlap="0">
+            <wp:simplePos x="0" y="0"/>
+            <wp:positionH relativeFrom="margin">
+              <wp:align>center</wp:align>
+            </wp:positionH>
+            <wp:positionV relativeFrom="margin">
+              <wp:align>top</wp:align>
+            </wp:positionV>
+            <wp:extent cx="5486400" cy="3094264"/>
+            <wp:effectExtent l="0" t="0" r="0" b="0"/>
+            <wp:wrapTopAndBottom/>
             <wp:docPr id="15" name="Picture 15"/>
-            <wp:cNvGraphicFramePr>
-              <a:graphicFrameLocks noChangeAspect="1"/>
-            </wp:cNvGraphicFramePr>
-            <a:graphic>
+            <wp:cNvGraphicFramePr/>
+            <a:graphic xmlns:a="http://schemas.openxmlformats.org/drawingml/2006/main" xmlns:pic="http://schemas.openxmlformats.org/drawingml/2006/picture">
               <a:graphicData uri="http://schemas.openxmlformats.org/drawingml/2006/picture">
                 <pic:pic>
                   <pic:nvPicPr>
-                    <pic:cNvPr id="0" name="fig4c.png"/>
+                    <pic:cNvPr id="0" name="fig4_cap.png"/>
                     <pic:cNvPicPr/>
                   </pic:nvPicPr>
                   <pic:blipFill>
@@ -4282,40 +4194,16 @@
                   <pic:spPr>
                     <a:xfrm>
                       <a:off x="0" y="0"/>
-                      <a:ext cx="5486400" cy="2824843"/>
+                      <a:ext cx="5486400" cy="3094264"/>
                     </a:xfrm>
                     <a:prstGeom prst="rect"/>
                   </pic:spPr>
                 </pic:pic>
               </a:graphicData>
             </a:graphic>
-          </wp:inline>
+          </wp:anchor>
         </w:drawing>
       </w:r>
-    </w:p>
-    <w:p>
-      <w:pPr>
-        <w:spacing w:after="160" w:before="0"/>
-        <w:jc w:val="center"/>
-      </w:pPr>
-      <w:r>
-        <w:rPr>
-          <w:i/>
-          <w:sz w:val="22"/>
-        </w:rPr>
-        <w:t>Fig. 4: Pairwise precision and recall of every method, Play Store held-out halves</w:t>
-      </w:r>
-    </w:p>
-    <w:p>
-      <w:pPr>
-        <w:sectPr>
-          <w:type w:val="continuous"/>
-          <w:pgSz w:w="12240" w:h="15840"/>
-          <w:pgMar w:top="1080" w:right="1008" w:bottom="1440" w:left="1008" w:header="720" w:footer="720" w:gutter="0"/>
-          <w:cols w:space="360" w:num="1"/>
-          <w:docGrid w:linePitch="360"/>
-        </w:sectPr>
-      </w:pPr>
     </w:p>
     <w:p>
       <w:pPr>
@@ -4335,33 +4223,29 @@
     </w:p>
     <w:p>
       <w:pPr>
-        <w:sectPr>
-          <w:type w:val="continuous"/>
-          <w:pgSz w:w="12240" w:h="15840"/>
-          <w:pgMar w:top="1080" w:right="1008" w:bottom="1440" w:left="1008" w:header="720" w:footer="720" w:gutter="0"/>
-          <w:cols w:space="360" w:num="2"/>
-          <w:docGrid w:linePitch="360"/>
-        </w:sectPr>
-      </w:pPr>
-    </w:p>
-    <w:p>
-      <w:pPr>
-        <w:spacing w:after="40" w:before="120"/>
+        <w:spacing w:after="0" w:before="0"/>
         <w:jc w:val="center"/>
       </w:pPr>
       <w:r>
         <w:drawing>
-          <wp:inline xmlns:a="http://schemas.openxmlformats.org/drawingml/2006/main" xmlns:pic="http://schemas.openxmlformats.org/drawingml/2006/picture">
-            <wp:extent cx="5486400" cy="2367643"/>
+          <wp:anchor distT="0" distB="114300" distL="0" distR="0" simplePos="0" relativeHeight="251659264" behindDoc="0" locked="0" layoutInCell="1" allowOverlap="0">
+            <wp:simplePos x="0" y="0"/>
+            <wp:positionH relativeFrom="margin">
+              <wp:align>center</wp:align>
+            </wp:positionH>
+            <wp:positionV relativeFrom="margin">
+              <wp:align>top</wp:align>
+            </wp:positionV>
+            <wp:extent cx="5486400" cy="2637064"/>
+            <wp:effectExtent l="0" t="0" r="0" b="0"/>
+            <wp:wrapTopAndBottom/>
             <wp:docPr id="16" name="Picture 16"/>
-            <wp:cNvGraphicFramePr>
-              <a:graphicFrameLocks noChangeAspect="1"/>
-            </wp:cNvGraphicFramePr>
-            <a:graphic>
+            <wp:cNvGraphicFramePr/>
+            <a:graphic xmlns:a="http://schemas.openxmlformats.org/drawingml/2006/main" xmlns:pic="http://schemas.openxmlformats.org/drawingml/2006/picture">
               <a:graphicData uri="http://schemas.openxmlformats.org/drawingml/2006/picture">
                 <pic:pic>
                   <pic:nvPicPr>
-                    <pic:cNvPr id="0" name="fig5c.png"/>
+                    <pic:cNvPr id="0" name="fig5_cap.png"/>
                     <pic:cNvPicPr/>
                   </pic:nvPicPr>
                   <pic:blipFill>
@@ -4373,40 +4257,16 @@
                   <pic:spPr>
                     <a:xfrm>
                       <a:off x="0" y="0"/>
-                      <a:ext cx="5486400" cy="2367643"/>
+                      <a:ext cx="5486400" cy="2637064"/>
                     </a:xfrm>
                     <a:prstGeom prst="rect"/>
                   </pic:spPr>
                 </pic:pic>
               </a:graphicData>
             </a:graphic>
-          </wp:inline>
+          </wp:anchor>
         </w:drawing>
       </w:r>
-    </w:p>
-    <w:p>
-      <w:pPr>
-        <w:spacing w:after="160" w:before="0"/>
-        <w:jc w:val="center"/>
-      </w:pPr>
-      <w:r>
-        <w:rPr>
-          <w:i/>
-          <w:sz w:val="22"/>
-        </w:rPr>
-        <w:t>Fig. 5: Recall with and without one re-joining pass; precision shown below each pair</w:t>
-      </w:r>
-    </w:p>
-    <w:p>
-      <w:pPr>
-        <w:sectPr>
-          <w:type w:val="continuous"/>
-          <w:pgSz w:w="12240" w:h="15840"/>
-          <w:pgMar w:top="1080" w:right="1008" w:bottom="1440" w:left="1008" w:header="720" w:footer="720" w:gutter="0"/>
-          <w:cols w:space="360" w:num="1"/>
-          <w:docGrid w:linePitch="360"/>
-        </w:sectPr>
-      </w:pPr>
     </w:p>
     <w:p>
       <w:pPr>
@@ -5042,33 +4902,29 @@
     </w:p>
     <w:p>
       <w:pPr>
-        <w:sectPr>
-          <w:type w:val="continuous"/>
-          <w:pgSz w:w="12240" w:h="15840"/>
-          <w:pgMar w:top="1080" w:right="1008" w:bottom="1440" w:left="1008" w:header="720" w:footer="720" w:gutter="0"/>
-          <w:cols w:space="360" w:num="2"/>
-          <w:docGrid w:linePitch="360"/>
-        </w:sectPr>
-      </w:pPr>
-    </w:p>
-    <w:p>
-      <w:pPr>
-        <w:spacing w:after="40" w:before="120"/>
+        <w:spacing w:after="0" w:before="0"/>
         <w:jc w:val="center"/>
       </w:pPr>
       <w:r>
         <w:drawing>
-          <wp:inline xmlns:a="http://schemas.openxmlformats.org/drawingml/2006/main" xmlns:pic="http://schemas.openxmlformats.org/drawingml/2006/picture">
-            <wp:extent cx="5486400" cy="2024743"/>
+          <wp:anchor distT="0" distB="114300" distL="0" distR="0" simplePos="0" relativeHeight="251659264" behindDoc="0" locked="0" layoutInCell="1" allowOverlap="0">
+            <wp:simplePos x="0" y="0"/>
+            <wp:positionH relativeFrom="margin">
+              <wp:align>center</wp:align>
+            </wp:positionH>
+            <wp:positionV relativeFrom="margin">
+              <wp:align>top</wp:align>
+            </wp:positionV>
+            <wp:extent cx="5486400" cy="2465614"/>
+            <wp:effectExtent l="0" t="0" r="0" b="0"/>
+            <wp:wrapTopAndBottom/>
             <wp:docPr id="17" name="Picture 17"/>
-            <wp:cNvGraphicFramePr>
-              <a:graphicFrameLocks noChangeAspect="1"/>
-            </wp:cNvGraphicFramePr>
-            <a:graphic>
+            <wp:cNvGraphicFramePr/>
+            <a:graphic xmlns:a="http://schemas.openxmlformats.org/drawingml/2006/main" xmlns:pic="http://schemas.openxmlformats.org/drawingml/2006/picture">
               <a:graphicData uri="http://schemas.openxmlformats.org/drawingml/2006/picture">
                 <pic:pic>
                   <pic:nvPicPr>
-                    <pic:cNvPr id="0" name="fig6c.png"/>
+                    <pic:cNvPr id="0" name="fig6_cap.png"/>
                     <pic:cNvPicPr/>
                   </pic:nvPicPr>
                   <pic:blipFill>
@@ -5080,40 +4936,16 @@
                   <pic:spPr>
                     <a:xfrm>
                       <a:off x="0" y="0"/>
-                      <a:ext cx="5486400" cy="2024743"/>
+                      <a:ext cx="5486400" cy="2465614"/>
                     </a:xfrm>
                     <a:prstGeom prst="rect"/>
                   </pic:spPr>
                 </pic:pic>
               </a:graphicData>
             </a:graphic>
-          </wp:inline>
+          </wp:anchor>
         </w:drawing>
       </w:r>
-    </w:p>
-    <w:p>
-      <w:pPr>
-        <w:spacing w:after="160" w:before="0"/>
-        <w:jc w:val="center"/>
-      </w:pPr>
-      <w:r>
-        <w:rPr>
-          <w:i/>
-          <w:sz w:val="22"/>
-        </w:rPr>
-        <w:t>Fig. 6: Share of simulated incidents detected in 6-hour windows; InsightDesk under one false alarm per 100 windows</w:t>
-      </w:r>
-    </w:p>
-    <w:p>
-      <w:pPr>
-        <w:sectPr>
-          <w:type w:val="continuous"/>
-          <w:pgSz w:w="12240" w:h="15840"/>
-          <w:pgMar w:top="1080" w:right="1008" w:bottom="1440" w:left="1008" w:header="720" w:footer="720" w:gutter="0"/>
-          <w:cols w:space="360" w:num="1"/>
-          <w:docGrid w:linePitch="360"/>
-        </w:sectPr>
-      </w:pPr>
     </w:p>
     <w:p>
       <w:pPr>

</xml_diff>

<commit_message>
Paper: fix every audit finding and rebuild
- Batch LLM: measured order sensitivity (78-95% of grouped pairs kept) and
  no memory across batches, replacing the unsupported 54%.
- LLM labellers: codebook result (P 0.83-0.87) explained as test-set
  knowledge; own problem list P 0.62, F1 0.32.
- Thresholds: 0.8306/0.26 calibrated on all 338 Play Store reviews for the
  deployed system and external tests; Play Store halves use their own.
- Median 21 words; kappa 0.57 -> 0.74 after re-check; entity-matching F1
  76.4-98.4; Firefox 0.92-0.96; BM25 0.40-0.44 / REP 0.43-0.44; unseen
  company pairwise 0.59; h chosen on Firefox sample 2; t_high zone from
  review_stats; vague-alarm threshold grid stated as run; running example
  marked illustrative; TODOs removed; topic list corrected.
- Topic snapshot and coherence script (moved to reports/topics) saved.
- Audit report, speaker notes and test summary updated to match.
</commit_message>
<xml_diff>
--- a/reports/paper/InsightDesk_paper.docx
+++ b/reports/paper/InsightDesk_paper.docx
@@ -184,7 +184,7 @@
           <w:i w:val="0"/>
           <w:sz w:val="24"/>
         </w:rPr>
-        <w:t>A B2B SaaS support desk sees hundreds of complaints a day. The operational questions are problem-level: how many customers are hit by the same issue, is it suddenly growing, what is the likely cause, and who must act. Answering them requires a step that most tools skip or hide: deciding, as each complaint arrives, whether it reports a problem already known or a new one.</w:t>
+        <w:t>A B2B SaaS support desk receives a steady stream of complaints through several channels. The operational questions are problem-level: how many customers are hit by the same issue, is it suddenly growing, what is the likely cause, and who must act. Answering them requires a step that most tools skip or hide: deciding, as each complaint arrives, whether it reports a problem already known or a new one.</w:t>
       </w:r>
     </w:p>
     <w:p>
@@ -200,7 +200,7 @@
           <w:i w:val="0"/>
           <w:sz w:val="24"/>
         </w:rPr>
-        <w:t>This step is hard for three reasons. First, complaints are short and noisy (21 words on average in our Play Store data) and two reports of one problem often share almost no vocabulary. Second, the decision must be online and stable: a case that changes membership when the input order changes cannot carry counts, spike history or an escalation record. Third, a wrong merge is costly, because it inflates a case and can trigger a false escalation.</w:t>
+        <w:t>This step is hard for three reasons. First, complaints are short and noisy (a median of 21 words in our Play Store data, mean 28) and two reports of one problem often share almost no vocabulary. Second, the decision must be online and stable: a case that changes membership when the input order changes cannot carry counts, spike history or an escalation record. Third, a wrong merge is costly, because it inflates a case and can trigger a false escalation.</w:t>
       </w:r>
     </w:p>
     <w:p>
@@ -419,7 +419,7 @@
         <w:rPr>
           <w:sz w:val="24"/>
         </w:rPr>
-        <w:t>A recent large study of duplicate bug-report detection [3] finds that classic retrieval such as REP [22] remains competitive with deep models, and Cupid [4] improves it by letting an LLM extract the essentials of each report first (Recall-Rate@10 0.60–0.65). Bi-encoders such as SBERT [23] give indexable embeddings, while cross-encoders built on BERT [24] are more accurate but cannot be indexed. LLMs used zero-shot as matchers reach F1 89.6–98.4 on entity-matching benchmarks [5], and LLM judges agree with human preferences on many tasks [6], [7]; their known position and verbosity biases argue for bounding each decision, which InsightDesk does with retrieval and calibrated thresholds.</w:t>
+        <w:t>A recent large study of duplicate bug-report detection [3] finds that classic retrieval such as REP [22] remains competitive with deep models, and Cupid [4] improves it by letting an LLM extract the essentials of each report first (Recall-Rate@10 0.60–0.65). Bi-encoders such as SBERT [23] give indexable embeddings, while cross-encoders built on BERT [24] are more accurate but cannot be indexed. LLMs used zero-shot as matchers reach F1 76.4–98.4 on six entity-matching benchmarks [5], and LLM judges agree with human preferences on many tasks [6], [7]; their known position and verbosity biases argue for bounding each decision, which InsightDesk does with retrieval and calibrated thresholds.</w:t>
       </w:r>
     </w:p>
     <w:p>
@@ -1275,7 +1275,7 @@
                 <w:b w:val="0"/>
                 <w:sz w:val="18"/>
               </w:rPr>
-              <w:t>z &gt; 2 per tag</w:t>
+              <w:t>z-score per tag, ~100-day baseline</w:t>
             </w:r>
           </w:p>
         </w:tc>
@@ -1524,7 +1524,7 @@
           <w:i w:val="0"/>
           <w:sz w:val="24"/>
         </w:rPr>
-        <w:t>A signed-in customer submits a complaint through the React dashboard or an API client; the FastAPI service stores it with its product, user and source channel (for example web form, app review or chat). Text beyond 5,000 characters is truncated. Cleaning uses label-free boilerplate suppression. The text is split into segments (sentences, clauses and a lead-in phrase). A segment is a boilerplate candidate when it recurs in at least 8 complaints with segment cosine similarity of at least 0.90, and it is confirmed as boilerplate when the remaining text of those complaints is unrelated (mean cosine below 0.30), as with greetings such as “Hi team, please help”. Boilerplate is dropped while at least one segment is always kept; the text is lower-cased and stripped of punctuation and stop words. Negations (not, never, can’t) are kept, because “works” and “doesn’t work” must not look alike. The original text is kept for display and for the LLM judge. For the running example, only the complaint itself remains.</w:t>
+        <w:t>A signed-in customer submits a complaint through the React dashboard or an API client; the FastAPI service stores it with its product, user and source channel (for example web form, app review or chat). Text beyond 5,000 characters is truncated. Cleaning uses label-free boilerplate suppression, recomputed every 6 hours over the most recent stored complaints (at most 2,000). The text is split into segments (sentences, clauses and a lead-in phrase). A segment is a boilerplate candidate when it recurs in at least 8 complaints with segment cosine similarity of at least 0.90, and it is confirmed as boilerplate when the remaining text of those complaints is unrelated (mean cosine below 0.30), as with greetings such as “Hi team, please help”. A segment of an arriving complaint that is a near-copy (cosine at least 0.90) of a listed boilerplate segment is dropped, while at least one segment is always kept; on our Play Store reviews the rule finds no boilerplate, while on Bugzilla reports it removes the bug-template lines; the text is lower-cased and stripped of punctuation and stop words. Negations such as not, never and no are kept, because “works” and “doesn’t work” must not look alike. The original text is kept for display and for the LLM judge. For the running example, only the complaint itself remains.</w:t>
       </w:r>
     </w:p>
     <w:p>
@@ -1778,7 +1778,7 @@
           <w:i w:val="0"/>
           <w:sz w:val="24"/>
         </w:rPr>
-        <w:t>Exemplars let one case match differently worded reports of the same problem, which a single centroid cannot. Each exemplar is stored in Pinecone with its case, product, vague flag and the text of the complaint that founded the case; one query returns the 60 nearest vectors, which are ranked per case by their best exemplar. For the running example, the closest case is “OTP not received on login” with S* = 0.71.</w:t>
+        <w:t>Exemplars let one case match differently worded reports of the same problem, which a single centroid cannot. Each exemplar is stored in Pinecone with its case, product, vague flag and the text of the complaint that founded the case; one query returns the 60 nearest vectors, which are ranked per case by their best exemplar. For the running example, suppose the closest case is “OTP not received on login” with S* = 0.71 (an illustrative value).</w:t>
       </w:r>
     </w:p>
     <w:p>
@@ -1896,7 +1896,7 @@
           <w:i w:val="0"/>
           <w:sz w:val="24"/>
         </w:rPr>
-        <w:t>where J is the LLM judge (Phase 4). Both thresholds are set once on a labelled tuning half, using only pairs within the same product. With y_i the true problem of complaint i and s_ij the similarity of complaints i and j:</w:t>
+        <w:t>where J is the LLM judge (Phase 4). Both thresholds are computed from labelled pairs within the same product: in every Play Store evaluation from the tuning half only, and for the deployed system once from all labelled Play Store reviews. With y_i the true problem of complaint i and s_ij the similarity of complaints i and j:</w:t>
       </w:r>
     </w:p>
     <w:tbl>
@@ -2074,7 +2074,7 @@
           <w:i w:val="0"/>
           <w:sz w:val="24"/>
         </w:rPr>
-        <w:t>the 20th percentile of duplicate-pair similarities, so that 80% of true duplicate pairs lie at or above the band’s lower edge. Calibrated on the Play Store tuning data this gives t_low = 0.26 and t_high = 0.8306. The 20th-percentile rule proved conservative on short text: raising the lower threshold to 0.40 on app reviews improved precision and recall together while sending fewer complaints to the judge, and the setting was confirmed on unseen apps under a pre-declared rule, whereas on long bug reports it made no real difference (Section VII-B). The deployed system therefore uses a per-channel lower threshold and one upper threshold for every channel:</w:t>
+        <w:t>the 20th percentile of duplicate-pair similarities, so that 80% of true duplicate pairs lie at or above the band’s lower edge. Calibrated on all 338 labelled Play Store reviews this gives t_low = 0.26 and t_high = 0.8306, the values used in the deployed system and in every test on other data (Bugzilla, unseen products, the unseen company, IT tickets); within the Play Store halves each tuning half yields its own values (t_high 0.70–0.77, t_low 0.24–0.30), so no Play Store score uses thresholds that saw the scored reviews. The 20th-percentile rule proved conservative on short text: raising the lower threshold to 0.40 on app reviews improved precision and recall together while sending fewer complaints to the judge, and the setting was confirmed on unseen apps under a pre-declared rule, whereas on long bug reports it made no real difference (Section VII-B). The deployed system therefore uses a per-channel lower threshold and one upper threshold for every channel:</w:t>
       </w:r>
     </w:p>
     <w:tbl>
@@ -2208,7 +2208,7 @@
           <w:i w:val="0"/>
           <w:sz w:val="24"/>
         </w:rPr>
-        <w:t>The judge never acts alone. Retrieval decides which cases it may choose from (at most five, same product only), the thresholds settle clear matches and clear non-matches without it, a failed or uncertain answer never merges, re-joining limits each case to one merge per pass, and no escalation leaves the system without human approval. Each complaint receives at most one judge decision, never pairwise comparisons. In our runs the band covered 66% of short reviews at the deployed setting and 90–96% of bug reports. The judge answered “too vague to tell” for 20% of Play Store complaints and 7% of bug reports. A decision takes 1.34 s at the median and costs about $0.24 per 1,000 judged complaints (Section VII-E).</w:t>
+        <w:t>The judge never acts alone. Retrieval decides which cases it may choose from (at most five, same product only), the thresholds settle clear matches and clear non-matches without it, a failed or uncertain answer never merges, re-joining limits each case to one merge per pass, and no escalation leaves the system without human approval. Each complaint receives at most one judge decision, never pairwise comparisons. In our runs the band covered 66% of short reviews at the deployed setting and 90–96% of bug reports. The judge answered “too vague to tell” for 20% of Play Store complaints and 7% of bug reports (at t_low 0.26). A decision takes 1.34 s at the median and costs about $0.24 per 1,000 judged complaints (Section VII-E).</w:t>
       </w:r>
     </w:p>
     <w:p>
@@ -2382,7 +2382,7 @@
           <w:i w:val="0"/>
           <w:sz w:val="24"/>
         </w:rPr>
-        <w:t>; the 20% and 15% triggers are operating defaults chosen empirically, not tuned. Departments come from a fixed rule table, not an LLM: five departments (Engineering, Authentication, Payments, Customer Success, Platform) each have a list of trigger words (for Authentication: login, password, otp, signin, verification, token), a topic goes to the department whose list matches most of its five top keywords, a topic with no match goes to General Support, and an operator can override the department in the dashboard. On the 306 cases of the test deployment BERTopic found 44 topics and left 41 cases (13%) as outliers. Their c_v coherence is 0.49, against 0.38 for random five-word sets from the same texts, so the topics are moderately coherent; the largest are login and sign-in (19 cases), notifications (18), reinstalling or the app not working (16), support plans (15) and crashes after a new version (10). The rule table routed only 19 of the 44 topics to a named department and sent 25 to General Support, so routing is the weakest step; a learned or LLM-based mapping is left to future work</w:t>
+        <w:t>; the 20% and 15% triggers are operating defaults chosen empirically, not tuned. Departments come from a fixed rule table, not an LLM: five departments (Engineering, Authentication, Payments, Customer Success, Platform) each have a list of trigger words (for Authentication: login, password, otp, signin, verification, token), a topic goes to the department whose list matches most of its five top keywords, a topic with no match goes to General Support, and an operator can override the department in the dashboard. On the 306 cases of the test deployment BERTopic found 44 topics and left 41 cases (13%) as outliers. Their c_v coherence is 0.49, against 0.38 for random five-word sets from the same texts, so the topics are moderately coherent; the largest are login and sign-in (19 cases), notifications (18), reinstalling or the app not working (16), support plans (15) and email addresses (11). The rule table routed only 19 of the 44 topics to a named department and sent 25 to General Support, so routing is the weakest step; a learned or LLM-based mapping is left to future work</w:t>
       </w:r>
       <w:r>
         <w:rPr>
@@ -2725,7 +2725,7 @@
           <w:i w:val="0"/>
           <w:sz w:val="24"/>
         </w:rPr>
-        <w:t xml:space="preserve"> The threshold was fixed before testing: among p ∈ {0.01, 0.001} and a minimum count m ∈ {2, 3, 4}, p &lt; 0.001 with m = 2 was the loosest setting that kept false alerts at or below 2 per 100 windows on both tuning sets (p = 0.01 gave 3.35 on bug reports). Confirmed unchanged on 588 reviews of unseen apps, the alarm detected every 10-complaint vague outage at a cost of 0.19 extra false alerts per 100 windows.</w:t>
+        <w:t xml:space="preserve"> The threshold was fixed before testing, for the per-window Poisson test that the vague alarm reuses: among p ∈ {0.01, 0.001} and a minimum count m ∈ {2, 3, 4}, the pre-declared rule picked the setting with the highest detection whose false alerts stayed at or below 2 per 100 windows on both tuning sets, which was m = 2 with p &lt; 0.001 (56% detection, at most 1.36 false alerts; p = 0.01 gave 3.35 on bug reports). Confirmed unchanged on 588 reviews of unseen apps, the alarm detected every 10-complaint vague outage at a cost of 0.19 extra false alerts per 100 windows.</w:t>
       </w:r>
     </w:p>
     <w:p>
@@ -2884,7 +2884,7 @@
           <w:i w:val="0"/>
           <w:sz w:val="24"/>
         </w:rPr>
-        <w:t>The backend is a Python FastAPI service. Complaints, cases, 6-hour windows, alert history and root-cause reports are stored in Supabase (PostgreSQL), and case exemplar vectors in a Pinecone index. Embeddings come from sentence-transformers all-MiniLM-L6-v2. The LLM judge, the case-pair judge and the root-cause writer call gpt-oss-120b through the Groq API in JSON mode at temperature 0; a small local model can be configured instead. Sentiment uses the Hugging Face transformers library, and topics use BERTopic with UMAP and HDBSCAN. A scheduler inside the API runs re-joining and topic upkeep every 6 hours. The dashboard is a React and TypeScript application that shows cases, incidents, alert groups, the vague-complaint alarm and root causes, and approved escalations are sent by SMTP. The pipeline is covered by unit tests and an end-to-end test of the API.</w:t>
+        <w:t>The backend is a Python FastAPI service. Complaints, cases, 6-hour window counts (each case’s spike history), root-cause reports and approved escalations are stored in Supabase (PostgreSQL), and case exemplar vectors in a Pinecone index. Embeddings come from sentence-transformers all-MiniLM-L6-v2. The LLM judge, the case-pair judge and the root-cause writer call gpt-oss-120b through the Groq API in JSON mode at temperature 0; a small local model can be configured instead. Sentiment uses the Hugging Face transformers library, and topics use BERTopic with UMAP and HDBSCAN. A scheduler inside the API runs re-joining and topic upkeep every 6 hours. The dashboard is a React and TypeScript application that shows cases, incidents, alert groups, the vague-complaint alarm and root causes, and approved escalations are sent by SMTP. The pipeline is covered by unit tests and an end-to-end test of the API.</w:t>
       </w:r>
     </w:p>
     <w:p>
@@ -2963,7 +2963,7 @@
           <w:i w:val="0"/>
           <w:sz w:val="24"/>
         </w:rPr>
-        <w:t>Stable online cases: membership does not depend on input order, so cases can carry counts, spike history and an escalation record.</w:t>
+        <w:t>Stable online cases: a decision, once made, is changed only by a logged re-joining merge, so case ids persist and cases can carry counts, spike history and an escalation record.</w:t>
       </w:r>
     </w:p>
     <w:p>
@@ -3054,7 +3054,7 @@
           <w:i w:val="0"/>
           <w:sz w:val="24"/>
         </w:rPr>
-        <w:t>Play Store reviews: 338 labelled reviews of six help-desk products (Zendesk, Freshdesk, Help Scout, Zoho Desk, LiveAgent, HappyFox), from a pool of 450 labelled by three team members. Labels follow a written codebook; inter-annotator agreement is Fleiss’ κ = 0.74.</w:t>
+        <w:t>Play Store reviews: 338 labelled reviews of six help-desk products (Zendesk, Freshdesk, Help Scout, Zoho Desk, LiveAgent, HappyFox), from a pool of 450 labelled by three team members. Labels follow a written codebook; inter-annotator agreement is Fleiss’ κ = 0.74 after a re-check round (0.57 in the first round).</w:t>
       </w:r>
     </w:p>
     <w:p>
@@ -3193,7 +3193,7 @@
           <w:i w:val="0"/>
           <w:sz w:val="24"/>
         </w:rPr>
-        <w:t>Bugzilla (independent, maintained by the projects). Duplicate links are created by Mozilla’s own triagers and developers during normal triage: a report is closed as RESOLVED DUPLICATE and linked to the report it repeats, after a person has compared the two. The labels predate this work, were made for engineering rather than research purposes, and the same Bugzilla histories are standard benchmarks for duplicate bug-report detection, including the public BugHub split used here. Because triagers link only the duplicates they notice, some true duplicates are unlinked; a correct merge of two unlinked duplicates is then scored as an error, so measured precision on Bugzilla is, if anything, conservative. We did not measure how many duplicates are unlinked in our samples, so we make no claim about the size of this effect. [TODO: cite a published estimate of Bugzilla duplicate-link completeness, or keep this sentence as is.]</w:t>
+        <w:t>Bugzilla (independent, maintained by the projects). Duplicate links are created by Mozilla’s own triagers and developers during normal triage: a report is closed as RESOLVED DUPLICATE and linked to the report it repeats, after a person has compared the two. The labels predate this work, were made for engineering rather than research purposes, and the same Bugzilla histories are standard benchmarks for duplicate bug-report detection, including the public BugHub split used here. Because triagers link only the duplicates they notice, some true duplicates are unlinked; a correct merge of two unlinked duplicates is then scored as an error, so measured precision on Bugzilla is, if anything, conservative. We did not measure how many duplicates are unlinked in our samples, so we make no claim about the size of this effect.</w:t>
       </w:r>
     </w:p>
     <w:p>
@@ -3215,7 +3215,7 @@
           <w:i w:val="0"/>
           <w:sz w:val="24"/>
         </w:rPr>
-        <w:t>Play Store (human, three annotators). Three team members labelled the reviews against a written codebook that defines a problem by its user-visible symptom (for example, “cannot log in” rather than “login”). On a 50-review overlap labelled by all three, agreement is Fleiss’ κ = 0.74 (95% CI 0.63–0.84), conventionally read as substantial; disagreements were resolved by discussion, and a blind relabelling round checked consistency. As an external check, GPT, Claude and gpt-oss given the same codebook agree with the human key at κ = 0.68–0.70, about as well as the annotators agree with each other, which indicates the codebook is reproducible rather than idiosyncratic. The labels were fixed before any of the pipeline variants reported here was scored, and thresholds are always tuned and scored on disjoint halves.</w:t>
+        <w:t>Play Store (human, three annotators). Three team members labelled the reviews against a written codebook that defines a problem by its user-visible symptom (for example, “cannot log in” rather than “login”). On a 50-review overlap labelled by all three, a first round reached Fleiss’ κ = 0.57; after the three re-checked the codebook rules they had read differently, agreement rose to κ = 0.74 (95% CI 0.63–0.84), conventionally read as substantial; remaining disagreements were resolved by discussion, and a blind relabelling round checked consistency. As an external check, GPT, Claude and gpt-oss given the same codebook agree with the human key at κ = 0.68–0.70, about as well as the annotators agree with each other, which indicates the codebook is reproducible rather than idiosyncratic. The labels were fixed before any of the pipeline variants reported here was scored, and thresholds are always tuned and scored on disjoint halves.</w:t>
       </w:r>
     </w:p>
     <w:p>
@@ -3237,7 +3237,7 @@
           <w:i w:val="0"/>
           <w:sz w:val="24"/>
         </w:rPr>
-        <w:t>Unseen products. Labels for Intercom, Jira Service Management and ServiceNow are the agreed key of two independent LLM labellers using the same codebook; we treat them as secondary evidence alongside the human and Bugzilla labels. The two labellers agree only moderately (pairwise κ = 0.38); the key keeps a pair as a duplicate only when both grouped it, so it is conservative but may still reflect shared LLM biases. A human spot-check of 50 of these reviews is planned. [TODO: add its result.]</w:t>
+        <w:t>Unseen products. Labels for Intercom, Jira Service Management and ServiceNow are the agreed key of two independent LLM labellers using the same codebook; we treat them as secondary evidence alongside the human and Bugzilla labels. The two labellers agree only moderately (pairwise κ = 0.38); the key keeps a pair as a duplicate only when both grouped it, so it is conservative but may still reflect shared LLM biases. A human spot-check of 50 of these review pairs has been prepared but not yet completed.</w:t>
       </w:r>
     </w:p>
     <w:p>
@@ -3310,7 +3310,7 @@
           <w:i w:val="0"/>
           <w:sz w:val="24"/>
         </w:rPr>
-        <w:t>Thresholds are tuned on one half of the problems and scored on the other half; we report the pooled scores of three held-out halves. Metrics are pairwise precision, recall and F1 over complaint pairs, B-cubed scores, and case precision (purity of each case). Every method has a threshold that trades precision against recall, so neither number alone can rank methods: any method reaches high precision by merging almost nothing, or high recall by merging almost everything. We therefore compare methods in two ways. First, each baseline’s threshold is tuned for its best F1 on the tuning half, the setting most favourable to it. Second, because a wrong merge inflates counts and can trigger a false escalation while a missed duplicate only leaves two smaller cases, we also compare recall at equal precision, with every baseline threshold set to reach precision 0.80 on the tuning half. Confidence intervals come from a cluster bootstrap over problems in which pairs between two draws of the same problem are not counted; a simulation with known ground truth confirms 92–99% coverage for the nominal 95% intervals. Every pipeline change was compared against the current version on identical data under a pass rule written before the run.</w:t>
+        <w:t>Thresholds are tuned on one half of the problems and scored on the other half; we report the pooled scores of three held-out halves. Metrics are pairwise precision, recall and F1 over complaint pairs, B-cubed scores, and case precision (B-cubed precision: for each complaint, the share of its case that reports the same problem, averaged over complaints). Every method has a threshold that trades precision against recall, so neither number alone can rank methods: any method reaches high precision by merging almost nothing, or high recall by merging almost everything. We therefore compare methods in two ways. First, each baseline’s threshold is tuned for its best F1 on the tuning half, the setting most favourable to it. Second, because a wrong merge inflates counts and can trigger a false escalation while a missed duplicate only leaves two smaller cases, we also compare recall at equal precision, with every baseline threshold set to reach precision 0.80 on the tuning half. Confidence intervals come from a cluster bootstrap over problems in which pairs between two draws of the same problem are not counted; a simulation with known ground truth confirms 92–99% coverage for the nominal 95% intervals. Every pipeline change was compared against the current version on identical data under a pass rule written before the run.</w:t>
       </w:r>
     </w:p>
     <w:p>
@@ -3929,7 +3929,7 @@
                 <w:b w:val="0"/>
                 <w:sz w:val="18"/>
               </w:rPr>
-              <w:t>Full codebook</w:t>
+              <w:t>Codebook or own problem list</w:t>
             </w:r>
           </w:p>
         </w:tc>
@@ -3944,7 +3944,7 @@
                 <w:b w:val="0"/>
                 <w:sz w:val="18"/>
               </w:rPr>
-              <w:t>Offline, needs codebook</w:t>
+              <w:t>Codebook knew the test problems; own list F1 0.32</w:t>
             </w:r>
           </w:p>
         </w:tc>
@@ -4006,7 +4006,7 @@
                 <w:b w:val="0"/>
                 <w:sz w:val="18"/>
               </w:rPr>
-              <w:t>Order-sensitive</w:t>
+              <w:t>Order-sensitive (89% of pairs kept); no memory</w:t>
             </w:r>
           </w:p>
         </w:tc>
@@ -4108,7 +4108,7 @@
           <w:i w:val="0"/>
           <w:sz w:val="24"/>
         </w:rPr>
-        <w:t>InsightDesk has the highest F1 of all methods that keep stable online cases: 0.49 on Play Store, with precision 0.83 and recall 0.35. Published duplicate finders given the same input, the same online procedure and their most favourable threshold reach F1 0.12–0.24; with their threshold chosen to reach precision 0.80 on the tuning half they recover about 1% of duplicate pairs on the held-out half, while InsightDesk recovers 35% at precision 0.83. Word and character overlap cannot separate different problems that share vocabulary, which is the case the LLM judge exists for. Fig. 4 places every method at its best-F1 setting. Topic models group by theme rather than by problem, and BERTopic’s precision of 0.16 shows how many unrelated complaints share a topic. General-purpose LLMs given our own codebook label with precision 0.68–0.71, below InsightDesk without a codebook. A single LLM call that groups a whole batch reaches a higher offline F1, but it is not stable: shuffling the input order leaves only 54% of its grouped pairs intact, which rules it out for counting and alerting. CLAP’s published setting reaches a similar precision (0.84) but finds only 2% of duplicate pairs.</w:t>
+        <w:t>InsightDesk has the highest F1 of all methods that keep stable online cases: 0.49 on Play Store, with precision 0.83 and recall 0.35. Published duplicate finders given the same input, the same online procedure and their most favourable threshold reach F1 0.12–0.24; with their threshold chosen to reach precision 0.80 on the tuning half they recover about 1% of duplicate pairs on the held-out half, while InsightDesk recovers 35% at precision 0.83. Word and character overlap cannot separate different problems that share vocabulary, which is the case the LLM judge exists for. Fig. 4 places every method at its best-F1 setting. Topic models group by theme rather than by problem, and BERTopic’s precision of 0.16 shows how many unrelated complaints share a topic. General-purpose LLMs that label each review with our codebook group better offline (precision 0.83–0.87, F1 0.64–0.67), but the codebook was written from these same reviews and already names the test problems; when the same model must build its own problem list from earlier reviews of the same companies and then classify new ones, precision falls to 0.62 and F1 to 0.32, below InsightDesk on the same halves (0.81 and 0.39 at t_low 0.26). A single LLM call that groups a whole batch of one product reaches a similar offline F1 (0.50), but its groups depend on the order of the input: listing the same reviews in three shuffled orders kept 78–95% (mean 89%) of its grouped pairs, against 99% for an identical rerun, and a batch call has no memory of earlier batches, so it cannot keep case ids, counts or spike histories as complaints arrive. CLAP’s published setting reaches a similar precision (0.84) but finds only 2% of duplicate pairs.</w:t>
       </w:r>
     </w:p>
     <w:p>
@@ -4424,7 +4424,7 @@
                 <w:b w:val="0"/>
                 <w:sz w:val="18"/>
               </w:rPr>
-              <w:t>0.87–0.96</w:t>
+              <w:t>0.92–0.96</w:t>
             </w:r>
           </w:p>
         </w:tc>
@@ -4749,7 +4749,7 @@
                 <w:b w:val="0"/>
                 <w:sz w:val="18"/>
               </w:rPr>
-              <w:t>BM25F 0.41–0.44</w:t>
+              <w:t>BM25 0.40–0.44, REP 0.43–0.44</w:t>
             </w:r>
           </w:p>
         </w:tc>
@@ -4836,7 +4836,7 @@
           <w:i w:val="0"/>
           <w:sz w:val="24"/>
         </w:rPr>
-        <w:t>The same upper threshold transfers from short app reviews to long bug reports, and to products and a company never seen in tuning. This transfer is also the main evidence that the rules of Section IV-C (the 0.97 precision target for t_high and the 20th percentile for t_low) give a robust operating point rather than one fitted to the tuning data. A sensitivity check supports this for t_high: around each half’s calibrated thresholds, lowering t_high by 0.03 or 0.08 keeps precision at 0.81–0.83 and F1 at 0.36–0.41 (calibrated setting: 0.81 and 0.39), while lowering it by 0.13 drops precision to 0.72. A label-only check of the zone around t_high found that only 2 held-out Play Store reviews scored above it, both joined correctly, so short reviews almost never reach automatic joins and the judge does the deciding.</w:t>
+        <w:t>The same upper threshold transfers from short app reviews to long bug reports, and to products and a company never seen in tuning. This transfer is also the main evidence that the rules of Section IV-C (the 0.97 precision target for t_high and the 20th percentile for t_low) give a robust operating point rather than one fitted to the tuning data. A sensitivity check supports this for t_high: around each half’s calibrated thresholds, lowering t_high by 0.03 or 0.08 keeps precision at 0.81–0.83 and F1 at 0.36–0.41 (calibrated setting: 0.81 and 0.39), while lowering it by 0.13 drops precision to 0.72. Only 4% of held-out Play Store complaints (20 of 505) reached an automatic join above t_high, against 86% decided by the judge, so on short reviews the judge does the deciding.</w:t>
       </w:r>
     </w:p>
     <w:p>
@@ -4852,7 +4852,7 @@
           <w:i w:val="0"/>
           <w:sz w:val="24"/>
         </w:rPr>
-        <w:t>Raising t_low, measured with live judge calls, leaves recall unchanged (0.256–0.264) while precision rises to 0.87 at +0.09 and 0.91 at +0.14 and the share of complaints sent to the judge falls from 86% to 61%. The 20th-percentile rule is therefore conservative on short reviews. Under a pre-declared confirmation on Firefox and Thunderbird, however, t_low = 0.40 left precision (0.912 vs 0.908) and recall (0.571 vs 0.578) essentially unchanged and reduced the judged share only from 96% to 90%, below the 10-point bar, because similarities of long bug reports mostly lie well above 0.40. A second pre-declared check on unseen short text, the 588 reviews of three unseen apps, met its bar: with t_low = 0.40 the judged share fell from 94% to 77%, precision rose from 0.608 to 0.635 and recall changed from 0.284 to 0.255, within the allowed 0.03. On the Play Store held-out halves, t_low = 0.40 gives precision 0.883, recall 0.284 and F1 0.430 before re-joining, against 0.810, 0.259 and 0.392, with 66% instead of 86% of complaints judged. InsightDesk therefore uses t_low = 0.40 for short-text channels (app reviews, chat) and keeps 0.26 for tickets, bug reports and its own complaint form; the unseen-app labels are LLM-made, so this setting is supported by secondary evidence. Recall is higher on bug reports, whose descriptions are specific, than on 21-word reviews, where reports of one problem often share little wording.</w:t>
+        <w:t>Raising t_low, measured with live judge calls, leaves recall unchanged (0.256–0.264) while precision rises to 0.87 at +0.09 and 0.91 at +0.14 and the share of complaints sent to the judge falls from 86% to 61%. The 20th-percentile rule is therefore conservative on short reviews. Under a pre-declared confirmation on Firefox and Thunderbird, however, t_low = 0.40 left precision (0.912 vs 0.908) and recall (0.571 vs 0.578) essentially unchanged and reduced the judged share only from 96% to 90%, below the 10-point bar, because similarities of long bug reports mostly lie well above 0.40. A second pre-declared check on unseen short text, the 588 reviews of three unseen apps, met its bar: with t_low = 0.40 the judged share fell from 94% to 77%, precision rose from 0.608 to 0.635 and recall changed from 0.284 to 0.255, within the allowed 0.03. On the Play Store held-out halves (each half with its own t_high), t_low = 0.40 gives precision 0.883, recall 0.284 and F1 0.430 before re-joining, against 0.810, 0.259 and 0.392, with 66% instead of 86% of complaints judged. InsightDesk therefore uses t_low = 0.40 for short-text channels (app reviews, chat) and keeps 0.26 for tickets, bug reports and its own complaint form; the unseen-app labels are LLM-made, so this setting is supported by secondary evidence. Recall is higher on bug reports, whose descriptions are specific, than on short reviews (median 21 words), where reports of one problem often share little wording.</w:t>
       </w:r>
     </w:p>
     <w:p>
@@ -4868,7 +4868,7 @@
           <w:i w:val="0"/>
           <w:sz w:val="24"/>
         </w:rPr>
-        <w:t>Complaint text varies by channel: a 21-word app review and a multi-paragraph bug report describe problems very differently. When every method’s threshold is tuned on Play Store reviews and applied unchanged to Firefox reports, InsightDesk’s precision rises from 0.83 to 0.96, while surface-similarity methods break down: MinHash-LSH and SimHash merge almost every pair (precision 0.01–0.02), and BM25 falls to precision 0.56 (Fig. 3). Their scores depend on text length and shared vocabulary, so a cut tuned on short reviews admits nearly all pairs of long reports. InsightDesk’s thresholds act on length-insensitive embedding similarity and only settle clear cases; uncertain pairs are decided by an LLM that reads both texts. Baselines tuned on Firefox itself do better (CLAP F1 0.37, BERTopic 0.54) but remain below InsightDesk’s 0.78, and they require labelled data in each new format. In practice a new deployment can start from the shipped calibration with no labelled data in its own format. Pairwise precision on unseen help-desk products (0.61–0.64) is lower than on the calibration data, so a small calibration set, or corrections that operators already make in the dashboard, would further improve a deployment. On 1,000 Endava IT service tickets, with the same settings, 90% of InsightDesk’s cases fall within a single ticket category (case precision 0.904 [0.896, 0.947]), against 0.655 for the earlier cross-encoder pipeline, while it groups far fewer tickets, as category labels are coarser than problems.</w:t>
+        <w:t>Complaint text varies by channel: an app review (median 21 words) and a bug report (median 87–92 words) describe problems very differently. When every method’s threshold is tuned on Play Store reviews and applied unchanged to Firefox reports, InsightDesk’s precision rises from 0.83 to 0.96, while surface-similarity methods break down: MinHash-LSH and SimHash merge almost every pair (precision 0.01–0.02), and BM25 falls to precision 0.56 (Fig. 3). Their scores depend on text length and shared vocabulary, so a cut tuned on short reviews admits nearly all pairs of long reports. InsightDesk’s thresholds act on length-insensitive embedding similarity and only settle clear cases; uncertain pairs are decided by an LLM that reads both texts. At their published or default settings, which were not tuned on short reviews, the baselines do better on Firefox (CLAP F1 0.37, BERTopic 0.54) but remain below InsightDesk’s 0.78, and choosing their setting for a new format needs labelled data in that format. In practice a new deployment can start from the shipped calibration with no labelled data in its own format. Pairwise precision on unseen help-desk products (0.61–0.64) is lower than on the calibration data, so a small calibration set, or corrections that operators already make in the dashboard, would further improve a deployment. On 1,000 Endava IT service tickets, with the same settings, 90% of InsightDesk’s cases fall within a single ticket category (case precision 0.904 [0.896, 0.947]), against 0.655 for the earlier cross-encoder pipeline, while it groups far fewer tickets, as category labels are coarser than problems.</w:t>
       </w:r>
     </w:p>
     <w:p>
@@ -4897,7 +4897,7 @@
           <w:i w:val="0"/>
           <w:sz w:val="24"/>
         </w:rPr>
-        <w:t>Outbreaks were simulated by moving the real reviews of one problem into a short burst inside a 30-day stream of 6-hour windows. On unseen Firefox and Thunderbird streams, the CUSUM detects 76% of outbreaks per case and 91% per alert group, at 0.38 and 0.69 false alerts per 100 windows; on short Play Store reviews, where outbreaks split across more cases, it detects 42–43% at 0.06. The z-score rule used by commercial feedback tools detects none on the same counts: with zero to two complaints per window a standard deviation gives no stable baseline. We compared the standard small-count alternatives on the same simulations. A raw count rule either over-alerts (at least 2 reports: 0.72–4.33 false alerts per 100 windows) or misses most outbreaks (at least 3: 25–49% detected), so a model of the baseline rate is needed. A Poisson tail test on each window (count ≥ 2, P &lt; 0.001) detected 71% and 84% on the unseen streams at 1.20 and 1.75 false alerts, three times the CUSUM’s, which is why InsightDesk uses the CUSUM. An EWMA chart on the same baseline (α 0.2–0.3, L 2–3) reached 86% detection on bug reports but at 3.2–3.6 false alerts per 100 windows, about nine times the CUSUM’s. Across h ∈ {1, 1.5, 2, 3, 4} and δ ∈ {0.5, 1, 2}, h = 2 with δ = 1 is the knee: h = 1.5 adds 10 points of detection for ten times the false alarms, and h = 3 loses a third of detections; h = 2 was chosen on Play Store and a first Firefox sample and confirmed unchanged on the unseen streams under a pre-declared rule. Real complaint counts are overdispersed: on 17,236 Firefox reports from the last two years, per-component variance-to-mean ratios have median 1.60 and pooled value 2.37 (95% CI 1.70–3.30). Nominal Poisson probabilities therefore understate false alarms (the tail test fires 0.61 times per 100 real windows against 0.10 nominal), so all rates above are empirical. Because the CUSUM looks for a rise of one report per window, it is relatively more sensitive on very busy cases; this regime was rare in our streams. Two blind LLM raters preferred InsightDesk’s grounded cause-explanation prompt over an alternative prompt (12:0 and 17:2) and found fewer unsupported claims.</w:t>
+        <w:t>Outbreaks were simulated by moving the real reviews of one problem into a short burst inside a 30-day stream of 6-hour windows. On unseen Firefox and Thunderbird streams, the CUSUM detects 76% of outbreaks per case and 91% per alert group, at 0.38 and 0.69 false alerts per 100 windows; on short Play Store reviews, where outbreaks split across more cases, it detects 42–43% at 0.06. The z-score rule used by commercial feedback tools detects none on the same counts: with zero to two complaints per window a standard deviation gives no stable baseline. We compared the standard small-count alternatives on the same simulations. A raw count rule either over-alerts (at least 2 reports: 0.72–4.33 false alerts per 100 windows) or misses most outbreaks (at least 3: 25–49% detected), so a model of the baseline rate is needed. A Poisson tail test on each window (count ≥ 2, P &lt; 0.001) detected 71% and 84% on the unseen streams at 1.20 and 1.75 false alerts, three times the CUSUM’s, which is why InsightDesk uses the CUSUM. An EWMA chart on the same baseline (α 0.2–0.3, L 2–3) reached 86% detection on bug reports but at 3.2–3.6 false alerts per 100 windows, about nine times the CUSUM’s. Across h ∈ {1, 1.5, 2, 3, 4} and δ ∈ {0.5, 1, 2}, h = 2 with δ = 1 is the knee: h = 1.5 adds 10 points of detection for ten times the false alarms, and h = 3 loses a third of detections; h = 2 was chosen on Play Store and a second Firefox sample and confirmed unchanged on the unseen streams under a pre-declared rule. Real complaint counts are overdispersed: on 17,236 Firefox reports from the last two years, per-component variance-to-mean ratios have median 1.60 and pooled value 2.37 (95% CI 1.70–3.30). Nominal Poisson probabilities therefore understate false alarms (the tail test fires 0.61 times per 100 real windows against 0.10 nominal), so all rates above are empirical. Because the CUSUM looks for a rise of one report per window, it is relatively more sensitive on very busy cases; this regime was rare in our streams. Two blind LLM raters preferred InsightDesk’s grounded cause-explanation prompt over an alternative prompt (12:0 and 17:2) and found fewer unsupported claims.</w:t>
       </w:r>
     </w:p>
     <w:p>
@@ -5096,7 +5096,7 @@
           <w:i w:val="0"/>
           <w:sz w:val="24"/>
         </w:rPr>
-        <w:t>Deployment without local calibration. Out of the box, about 90% of complaints land in the right case (case precision 0.89–0.92 on an unseen company and unseen products), while pairwise precision there (0.61–0.64) shows that errors gather in a few large mixed cases. Because every escalation requires human approval and spikes require a burst of reports, such errors surface as a count or a suggestion a reviewer can reject, never as an automatic action. InsightDesk is therefore usable as decision support from the first day; for counts that are trusted without review, a short calibration on the company’s own complaints is recommended.</w:t>
+        <w:t>Deployment without local calibration. Out of the box, about 90% of complaints land in the right case (case precision 0.89–0.92 on an unseen company and unseen products), while pairwise precision there (0.59–0.64) shows that errors gather in a few large mixed cases. Because every escalation requires human approval and spikes require a burst of reports, such errors surface as a count or a suggestion a reviewer can reject, never as an automatic action. InsightDesk is therefore usable as decision support from the first day; for counts that are trusted without review, a short calibration on the company’s own complaints is recommended.</w:t>
       </w:r>
     </w:p>
     <w:p>

</xml_diff>

<commit_message>
Fix the judge cache write and tighten paper wording after re-checking
- provider.py: the cache line ending was written as a literal line break,
  so the module did not parse and every judge call would have failed (and
  opened a new case). Added tests/test_provider_cache.py, which imports the
  provider; checked live against staging (JSON mode, cache hit).
- Paper: unseen-company test recalibrates on the other companies (not
  0.8306/0.26); vague outages all detected from 10 complaints; exemplar
  claim now the measured recall ceiling (0.58 -> 0.72); product filter only
  when a product is named; case precision wording; batch shuffle on one
  half; auto-join share at t_low 0.26; Bugzilla template examples.
</commit_message>
<xml_diff>
--- a/reports/paper/InsightDesk_paper.docx
+++ b/reports/paper/InsightDesk_paper.docx
@@ -114,7 +114,7 @@
           <w:i/>
           <w:sz w:val="22"/>
         </w:rPr>
-        <w:t>Support teams receive the same problem described in many different words. Counting, alerting and escalation all depend on first grouping these raw complaints into problem-level cases, yet published systems either cluster offline into topics, rely on per-ticket classification, or need structured telemetry. We present InsightDesk, an online pipeline that assigns each arriving complaint to a problem case: similarity retrieval over diverse case exemplars narrows each complaint to at most five candidate cases, a calibrated similarity band settles clear matches and clear non-matches, an LLM judge makes one bounded decision whenever similarity alone is not conclusive, and a periodic re-joining pass merges cases that online decisions split. On top of cases it computes per-case spike signals with a Poisson CUSUM, groups related cases for alerting, raises a separate alarm for vague complaints that fit no case, and escalates only after human approval. On 338 human-labelled Play Store reviews of six help-desk products, InsightDesk reaches pairwise precision 0.83, recall 0.35 and F1 0.49, against F1 0.05–0.25 for published app-review grouping and topic-model baselines on the same data. With the same upper threshold it reaches precision 0.87–0.96 on Bugzilla duplicate benchmarks (F1 0.78–0.79), case precision 0.92 on three unseen products and 0.89 on an unseen company. On outbreaks injected into real complaint streams, its CUSUM detects 76–91% on bug-report streams and 42–43% on short-review streams at under one false alarm per 100 windows, where the per-tag z-score rule common in feedback-analytics tools detects none, and outages made only of vague complaints are detected in all cases.</w:t>
+        <w:t>Support teams receive the same problem described in many different words. Counting, alerting and escalation all depend on first grouping these raw complaints into problem-level cases, yet published systems either cluster offline into topics, rely on per-ticket classification, or need structured telemetry. We present InsightDesk, an online pipeline that assigns each arriving complaint to a problem case: similarity retrieval over diverse case exemplars narrows each complaint to at most five candidate cases, a calibrated similarity band settles clear matches and clear non-matches, an LLM judge makes one bounded decision whenever similarity alone is not conclusive, and a periodic re-joining pass merges cases that online decisions split. On top of cases it computes per-case spike signals with a Poisson CUSUM, groups related cases for alerting, raises a separate alarm for vague complaints that fit no case, and escalates only after human approval. On 338 human-labelled Play Store reviews of six help-desk products, InsightDesk reaches pairwise precision 0.83, recall 0.35 and F1 0.49, against F1 0.05–0.25 for published app-review grouping and topic-model baselines on the same data. With the same upper threshold it reaches precision 0.87–0.96 on Bugzilla duplicate benchmarks (F1 0.78–0.79), case precision 0.92 on three unseen products and 0.89 on an unseen company. On outbreaks injected into real complaint streams, its CUSUM detects 76–91% on bug-report streams and 42–43% on short-review streams at under one false alarm per 100 windows, where the per-tag z-score rule common in feedback-analytics tools detects none, and outages made only of vague complaints are all detected once they reach 10 complaints.</w:t>
       </w:r>
     </w:p>
     <w:p>
@@ -1524,7 +1524,7 @@
           <w:i w:val="0"/>
           <w:sz w:val="24"/>
         </w:rPr>
-        <w:t>A signed-in customer submits a complaint through the React dashboard or an API client; the FastAPI service stores it with its product, user and source channel (for example web form, app review or chat). Text beyond 5,000 characters is truncated. Cleaning uses label-free boilerplate suppression, recomputed every 6 hours over the most recent stored complaints (at most 2,000). The text is split into segments (sentences, clauses and a lead-in phrase). A segment is a boilerplate candidate when it recurs in at least 8 complaints with segment cosine similarity of at least 0.90, and it is confirmed as boilerplate when the remaining text of those complaints is unrelated (mean cosine below 0.30), as with greetings such as “Hi team, please help”. A segment of an arriving complaint that is a near-copy (cosine at least 0.90) of a listed boilerplate segment is dropped, while at least one segment is always kept; on our Play Store reviews the rule finds no boilerplate, while on Bugzilla reports it removes the bug-template lines; the text is lower-cased and stripped of punctuation and stop words. Negations such as not, never and no are kept, because “works” and “doesn’t work” must not look alike. The original text is kept for display and for the LLM judge. For the running example, only the complaint itself remains.</w:t>
+        <w:t>A signed-in customer submits a complaint through the React dashboard or an API client; the FastAPI service stores it with its product, user and source channel (for example web form, app review or chat). Text beyond 5,000 characters is truncated. Cleaning uses label-free boilerplate suppression, recomputed every 6 hours over the most recent stored complaints (at most 2,000). The text is split into segments (sentences, clauses and a lead-in phrase). A segment is a boilerplate candidate when it recurs in at least 8 complaints with segment cosine similarity of at least 0.90, and it is confirmed as boilerplate when the remaining text of those complaints is unrelated (mean cosine below 0.30), as with greetings such as “Hi team, please help”. A segment of an arriving complaint that is a near-copy (cosine at least 0.90) of a listed boilerplate segment is dropped, while at least one segment is always kept; on our Play Store reviews the rule finds no boilerplate, while on Bugzilla reports it removes mostly bug-template lines such as “Steps to reproduce:” and “Reproducible: always”; the text is lower-cased and stripped of punctuation and stop words. Negations such as not, never and no are kept, because “works” and “doesn’t work” must not look alike. The original text is kept for display and for the LLM judge. For the running example, only the complaint itself remains.</w:t>
       </w:r>
     </w:p>
     <w:p>
@@ -1689,7 +1689,7 @@
           <w:i w:val="0"/>
           <w:sz w:val="24"/>
         </w:rPr>
-        <w:t>The score of complaint x against case C is its best match among the exemplars, and only cases of the same product are considered:</w:t>
+        <w:t>The score of complaint x against case C is its best match among the exemplars, and, when the complaint names a product, only cases of that product are considered:</w:t>
       </w:r>
     </w:p>
     <w:tbl>
@@ -1778,7 +1778,7 @@
           <w:i w:val="0"/>
           <w:sz w:val="24"/>
         </w:rPr>
-        <w:t>Exemplars let one case match differently worded reports of the same problem, which a single centroid cannot. Each exemplar is stored in Pinecone with its case, product, vague flag and the text of the complaint that founded the case; one query returns the 60 nearest vectors, which are ranked per case by their best exemplar. For the running example, suppose the closest case is “OTP not received on login” with S* = 0.71 (an illustrative value).</w:t>
+        <w:t>Exemplars let one case match differently worded reports of the same problem: with a perfect judge over the shortlist, diverse exemplars raise the pairwise recall that retrieval allows on the Play Store held-out halves from 0.58 (founding complaint only) to 0.72. Each exemplar is stored in Pinecone with its case, product, vague flag and the text of the complaint that founded the case; one query returns the 60 nearest vectors, which are ranked per case by their best exemplar. For the running example, suppose the closest case is “OTP not received on login” with S* = 0.71 (an illustrative value).</w:t>
       </w:r>
     </w:p>
     <w:p>
@@ -2074,7 +2074,7 @@
           <w:i w:val="0"/>
           <w:sz w:val="24"/>
         </w:rPr>
-        <w:t>the 20th percentile of duplicate-pair similarities, so that 80% of true duplicate pairs lie at or above the band’s lower edge. Calibrated on all 338 labelled Play Store reviews this gives t_low = 0.26 and t_high = 0.8306, the values used in the deployed system and in every test on other data (Bugzilla, unseen products, the unseen company, IT tickets); within the Play Store halves each tuning half yields its own values (t_high 0.70–0.77, t_low 0.24–0.30), so no Play Store score uses thresholds that saw the scored reviews. The 20th-percentile rule proved conservative on short text: raising the lower threshold to 0.40 on app reviews improved precision and recall together while sending fewer complaints to the judge, and the setting was confirmed on unseen apps under a pre-declared rule, whereas on long bug reports it made no real difference (Section VII-B). The deployed system therefore uses a per-channel lower threshold and one upper threshold for every channel:</w:t>
+        <w:t>the 20th percentile of duplicate-pair similarities, so that 80% of true duplicate pairs lie at or above the band’s lower edge. Calibrated on all 338 labelled Play Store reviews this gives t_low = 0.26 and t_high = 0.8306, the values used in the deployed system and in every test on other data (Bugzilla, unseen products, IT tickets), while the unseen-company test recalibrates on the other five companies each time; within the Play Store halves each tuning half yields its own values (t_high 0.70–0.77, t_low 0.24–0.30), so no Play Store score uses thresholds that saw the scored reviews. The 20th-percentile rule proved conservative on short text: raising the lower threshold to 0.40 on app reviews improved precision and recall together while sending fewer complaints to the judge, and the setting was confirmed on unseen apps under a pre-declared rule, whereas on long bug reports it made no real difference (Section VII-B). The deployed system therefore uses a per-channel lower threshold and one upper threshold for every channel:</w:t>
       </w:r>
     </w:p>
     <w:tbl>
@@ -2963,7 +2963,7 @@
           <w:i w:val="0"/>
           <w:sz w:val="24"/>
         </w:rPr>
-        <w:t>Stable online cases: a decision, once made, is changed only by a logged re-joining merge, so case ids persist and cases can carry counts, spike history and an escalation record.</w:t>
+        <w:t>Stable online cases: a decision, once made, is changed only by a recorded re-joining merge, so case ids persist and cases can carry counts, spike history and an escalation record.</w:t>
       </w:r>
     </w:p>
     <w:p>
@@ -4108,7 +4108,7 @@
           <w:i w:val="0"/>
           <w:sz w:val="24"/>
         </w:rPr>
-        <w:t>InsightDesk has the highest F1 of all methods that keep stable online cases: 0.49 on Play Store, with precision 0.83 and recall 0.35. Published duplicate finders given the same input, the same online procedure and their most favourable threshold reach F1 0.12–0.24; with their threshold chosen to reach precision 0.80 on the tuning half they recover about 1% of duplicate pairs on the held-out half, while InsightDesk recovers 35% at precision 0.83. Word and character overlap cannot separate different problems that share vocabulary, which is the case the LLM judge exists for. Fig. 4 places every method at its best-F1 setting. Topic models group by theme rather than by problem, and BERTopic’s precision of 0.16 shows how many unrelated complaints share a topic. General-purpose LLMs that label each review with our codebook group better offline (precision 0.83–0.87, F1 0.64–0.67), but the codebook was written from these same reviews and already names the test problems; when the same model must build its own problem list from earlier reviews of the same companies and then classify new ones, precision falls to 0.62 and F1 to 0.32, below InsightDesk on the same halves (0.81 and 0.39 at t_low 0.26). A single LLM call that groups a whole batch of one product reaches a similar offline F1 (0.50), but its groups depend on the order of the input: listing the same reviews in three shuffled orders kept 78–95% (mean 89%) of its grouped pairs, against 99% for an identical rerun, and a batch call has no memory of earlier batches, so it cannot keep case ids, counts or spike histories as complaints arrive. CLAP’s published setting reaches a similar precision (0.84) but finds only 2% of duplicate pairs.</w:t>
+        <w:t>InsightDesk has the highest F1 of all methods that keep stable online cases: 0.49 on Play Store, with precision 0.83 and recall 0.35. Published duplicate finders given the same input, the same online procedure and their most favourable threshold reach F1 0.12–0.24; with their threshold chosen to reach precision 0.80 on the tuning half they recover about 1% of duplicate pairs on the held-out half, while InsightDesk recovers 35% at precision 0.83. Word and character overlap cannot separate different problems that share vocabulary, which is the case the LLM judge exists for. Fig. 4 places every method at its best-F1 setting. Topic models group by theme rather than by problem, and BERTopic’s precision of 0.16 shows how many unrelated complaints share a topic. General-purpose LLMs that label each review with our codebook group better offline (precision 0.83–0.87, F1 0.64–0.67), but the codebook was written from these same reviews and already names the test problems; when gpt-oss-120b must build its own problem list from earlier reviews of the same companies and then classify new ones, precision falls to 0.62 and F1 to 0.32, below InsightDesk on the same halves (0.81 and 0.39 at t_low 0.26). A single LLM call that groups a whole batch of one product reaches a similar offline F1 (0.50), but its groups depend on the order of the input: listing the reviews of one held-out half in three shuffled orders kept 78–95% (mean 89%) of its grouped pairs, against 99% for an identical rerun, and a batch call has no memory of earlier batches, so it cannot keep case ids, counts or spike histories as complaints arrive. CLAP’s published setting reaches a similar precision (0.84) but finds only 2% of duplicate pairs.</w:t>
       </w:r>
     </w:p>
     <w:p>
@@ -4836,7 +4836,7 @@
           <w:i w:val="0"/>
           <w:sz w:val="24"/>
         </w:rPr>
-        <w:t>The same upper threshold transfers from short app reviews to long bug reports, and to products and a company never seen in tuning. This transfer is also the main evidence that the rules of Section IV-C (the 0.97 precision target for t_high and the 20th percentile for t_low) give a robust operating point rather than one fitted to the tuning data. A sensitivity check supports this for t_high: around each half’s calibrated thresholds, lowering t_high by 0.03 or 0.08 keeps precision at 0.81–0.83 and F1 at 0.36–0.41 (calibrated setting: 0.81 and 0.39), while lowering it by 0.13 drops precision to 0.72. Only 4% of held-out Play Store complaints (20 of 505) reached an automatic join above t_high, against 86% decided by the judge, so on short reviews the judge does the deciding.</w:t>
+        <w:t>The same upper threshold transfers from short app reviews to long bug reports, and to products and a company never seen in tuning. This transfer is also the main evidence that the rules of Section IV-C (the 0.97 precision target for t_high and the 20th percentile for t_low) give a robust operating point rather than one fitted to the tuning data. A sensitivity check supports this for t_high: around each half’s calibrated thresholds, lowering t_high by 0.03 or 0.08 keeps precision at 0.81–0.83 and F1 at 0.36–0.41 (calibrated setting: 0.81 and 0.39), while lowering it by 0.13 drops precision to 0.72. At t_low 0.26, only 4% of held-out Play Store complaints (20 of 505) reached an automatic join above t_high, against 86% decided by the judge, so on short reviews the judge does the deciding.</w:t>
       </w:r>
     </w:p>
     <w:p>
@@ -5096,7 +5096,7 @@
           <w:i w:val="0"/>
           <w:sz w:val="24"/>
         </w:rPr>
-        <w:t>Deployment without local calibration. Out of the box, about 90% of complaints land in the right case (case precision 0.89–0.92 on an unseen company and unseen products), while pairwise precision there (0.59–0.64) shows that errors gather in a few large mixed cases. Because every escalation requires human approval and spikes require a burst of reports, such errors surface as a count or a suggestion a reviewer can reject, never as an automatic action. InsightDesk is therefore usable as decision support from the first day; for counts that are trusted without review, a short calibration on the company’s own complaints is recommended.</w:t>
+        <w:t>Deployment without local calibration. Out of the box, about 90% of a complaint’s case-mates report the same problem (case precision 0.89–0.92 on an unseen company and unseen products), while pairwise precision there (0.59–0.64) shows that errors gather in a few large mixed cases. Because every escalation requires human approval and spikes require a burst of reports, such errors surface as a count or a suggestion a reviewer can reject, never as an automatic action. InsightDesk is therefore usable as decision support from the first day; for counts that are trusted without review, a short calibration on the company’s own complaints is recommended.</w:t>
       </w:r>
     </w:p>
     <w:p>

</xml_diff>

<commit_message>
Paper: academic year 2026-27, drop the pending spot-check sentence, full iPACK citation
- Title page: Academic Year 2026-27.
- Removed the sentence about the unfinished 50-pair human spot-check.
- iPACK reference now gives its authors (J. Liu et al.) and its exact title,
  checked against arXiv:2302.09520; all 29 references verified online.
- spike_detection.py: the baseline prior is about one complaint every
  14 windows (3.5 days), not every two weeks (comment only).
</commit_message>
<xml_diff>
--- a/reports/paper/InsightDesk_paper.docx
+++ b/reports/paper/InsightDesk_paper.docx
@@ -62,7 +62,7 @@
         <w:rPr>
           <w:sz w:val="22"/>
         </w:rPr>
-        <w:t>Academic Year 2025–26</w:t>
+        <w:t>Academic Year 2026–27</w:t>
       </w:r>
     </w:p>
     <w:p>
@@ -3237,7 +3237,7 @@
           <w:i w:val="0"/>
           <w:sz w:val="24"/>
         </w:rPr>
-        <w:t>Unseen products. Labels for Intercom, Jira Service Management and ServiceNow are the agreed key of two independent LLM labellers using the same codebook; we treat them as secondary evidence alongside the human and Bugzilla labels. The two labellers agree only moderately (pairwise κ = 0.38); the key keeps a pair as a duplicate only when both grouped it, so it is conservative but may still reflect shared LLM biases. A human spot-check of 50 of these review pairs has been prepared but not yet completed.</w:t>
+        <w:t>Unseen products. Labels for Intercom, Jira Service Management and ServiceNow are the agreed key of two independent LLM labellers using the same codebook; we treat them as secondary evidence alongside the human and Bugzilla labels. The two labellers agree only moderately (pairwise κ = 0.38); the key keeps a pair as a duplicate only when both grouped it, so it is conservative but may still reflect shared LLM biases.</w:t>
       </w:r>
     </w:p>
     <w:p>
@@ -5370,7 +5370,7 @@
         <w:rPr>
           <w:sz w:val="20"/>
         </w:rPr>
-        <w:t>[10]  “iPACK: Incident-aware duplicate ticket aggregation for cloud systems,” in Proc. ICSE, 2023 (arXiv:2302.09520).</w:t>
+        <w:t>[10]  J. Liu et al., “Incident-aware duplicate ticket aggregation for cloud systems,” in Proc. ICSE, 2023 (arXiv:2302.09520).</w:t>
       </w:r>
     </w:p>
     <w:p>

</xml_diff>